<commit_message>
feat(tests): add comprehensive unit and integration tests for user availability, list filters, constraint engine, drop expiry, email simulator, session store, and swap lifecycle
- Implemented integration tests for user availability exceptions and list filters.
- Added unit tests for constraint engine, drop expiry, email simulator, and session store functionalities.
- Enhanced swap lifecycle tests to cover cancellation scenarios and related notifications.
- Created README files for the web app and its source structure to improve documentation and onboarding.
</commit_message>
<xml_diff>
--- a/Docs/ShiftSync_Overview_QA.docx
+++ b/Docs/ShiftSync_Overview_QA.docx
@@ -23,12 +23,6 @@
         <w:gridCol w:w="9360"/>
       </w:tblGrid>
       <w:tr>
-        <w:tblPrEx>
-          <w:tblCellMar>
-            <w:top w:w="0" w:type="dxa"/>
-            <w:bottom w:w="0" w:type="dxa"/>
-          </w:tblCellMar>
-        </w:tblPrEx>
         <w:tc>
           <w:tcPr>
             <w:tcW w:w="0" w:type="auto"/>
@@ -123,12 +117,6 @@
         <w:gridCol w:w="3741"/>
       </w:tblGrid>
       <w:tr>
-        <w:tblPrEx>
-          <w:tblCellMar>
-            <w:top w:w="0" w:type="dxa"/>
-            <w:bottom w:w="0" w:type="dxa"/>
-          </w:tblCellMar>
-        </w:tblPrEx>
         <w:tc>
           <w:tcPr>
             <w:tcW w:w="0" w:type="auto"/>
@@ -292,12 +280,6 @@
         <w:gridCol w:w="9360"/>
       </w:tblGrid>
       <w:tr>
-        <w:tblPrEx>
-          <w:tblCellMar>
-            <w:top w:w="0" w:type="dxa"/>
-            <w:bottom w:w="0" w:type="dxa"/>
-          </w:tblCellMar>
-        </w:tblPrEx>
         <w:tc>
           <w:tcPr>
             <w:tcW w:w="0" w:type="auto"/>
@@ -385,21 +367,7 @@
         <w:rPr>
           <w:color w:val="0F172A"/>
         </w:rPr>
-        <w:t xml:space="preserve">The simplest way to understand the system: a </w:t>
-      </w:r>
-      <w:proofErr w:type="gramStart"/>
-      <w:r>
-        <w:rPr>
-          <w:color w:val="0F172A"/>
-        </w:rPr>
-        <w:t>Manager</w:t>
-      </w:r>
-      <w:proofErr w:type="gramEnd"/>
-      <w:r>
-        <w:rPr>
-          <w:color w:val="0F172A"/>
-        </w:rPr>
-        <w:t xml:space="preserve"> decides who works when and where. Staff see their schedules, can swap shifts with colleagues, or drop shifts they can't cover. The platform makes sure nothing illegal happens — no double-bookings, no rest violations, no one working a skill they don't have — and every change is tracked forever.</w:t>
+        <w:t>The simplest way to understand the system: a Manager decides who works when and where. Staff see their schedules, can swap shifts with colleagues, or drop shifts they can't cover. The platform makes sure nothing illegal happens — no double-bookings, no rest violations, no one working a skill they don't have — and every change is tracked forever.</w:t>
       </w:r>
     </w:p>
     <w:p>
@@ -440,12 +408,6 @@
         <w:gridCol w:w="8277"/>
       </w:tblGrid>
       <w:tr>
-        <w:tblPrEx>
-          <w:tblCellMar>
-            <w:top w:w="0" w:type="dxa"/>
-            <w:bottom w:w="0" w:type="dxa"/>
-          </w:tblCellMar>
-        </w:tblPrEx>
         <w:tc>
           <w:tcPr>
             <w:tcW w:w="0" w:type="auto"/>
@@ -506,12 +468,6 @@
         </w:tc>
       </w:tr>
       <w:tr>
-        <w:tblPrEx>
-          <w:tblCellMar>
-            <w:top w:w="0" w:type="dxa"/>
-            <w:bottom w:w="0" w:type="dxa"/>
-          </w:tblCellMar>
-        </w:tblPrEx>
         <w:tc>
           <w:tcPr>
             <w:tcW w:w="0" w:type="auto"/>
@@ -572,12 +528,6 @@
         </w:tc>
       </w:tr>
       <w:tr>
-        <w:tblPrEx>
-          <w:tblCellMar>
-            <w:top w:w="0" w:type="dxa"/>
-            <w:bottom w:w="0" w:type="dxa"/>
-          </w:tblCellMar>
-        </w:tblPrEx>
         <w:tc>
           <w:tcPr>
             <w:tcW w:w="0" w:type="auto"/>
@@ -691,12 +641,6 @@
         <w:gridCol w:w="9360"/>
       </w:tblGrid>
       <w:tr>
-        <w:tblPrEx>
-          <w:tblCellMar>
-            <w:top w:w="0" w:type="dxa"/>
-            <w:bottom w:w="0" w:type="dxa"/>
-          </w:tblCellMar>
-        </w:tblPrEx>
         <w:tc>
           <w:tcPr>
             <w:tcW w:w="0" w:type="auto"/>
@@ -759,12 +703,6 @@
         <w:gridCol w:w="9360"/>
       </w:tblGrid>
       <w:tr>
-        <w:tblPrEx>
-          <w:tblCellMar>
-            <w:top w:w="0" w:type="dxa"/>
-            <w:bottom w:w="0" w:type="dxa"/>
-          </w:tblCellMar>
-        </w:tblPrEx>
         <w:tc>
           <w:tcPr>
             <w:tcW w:w="0" w:type="auto"/>
@@ -827,12 +765,6 @@
         <w:gridCol w:w="9360"/>
       </w:tblGrid>
       <w:tr>
-        <w:tblPrEx>
-          <w:tblCellMar>
-            <w:top w:w="0" w:type="dxa"/>
-            <w:bottom w:w="0" w:type="dxa"/>
-          </w:tblCellMar>
-        </w:tblPrEx>
         <w:tc>
           <w:tcPr>
             <w:tcW w:w="0" w:type="auto"/>
@@ -896,12 +828,6 @@
         <w:gridCol w:w="9360"/>
       </w:tblGrid>
       <w:tr>
-        <w:tblPrEx>
-          <w:tblCellMar>
-            <w:top w:w="0" w:type="dxa"/>
-            <w:bottom w:w="0" w:type="dxa"/>
-          </w:tblCellMar>
-        </w:tblPrEx>
         <w:tc>
           <w:tcPr>
             <w:tcW w:w="0" w:type="auto"/>
@@ -964,12 +890,6 @@
         <w:gridCol w:w="9360"/>
       </w:tblGrid>
       <w:tr>
-        <w:tblPrEx>
-          <w:tblCellMar>
-            <w:top w:w="0" w:type="dxa"/>
-            <w:bottom w:w="0" w:type="dxa"/>
-          </w:tblCellMar>
-        </w:tblPrEx>
         <w:tc>
           <w:tcPr>
             <w:tcW w:w="0" w:type="auto"/>
@@ -1032,12 +952,6 @@
         <w:gridCol w:w="5862"/>
       </w:tblGrid>
       <w:tr>
-        <w:tblPrEx>
-          <w:tblCellMar>
-            <w:top w:w="0" w:type="dxa"/>
-            <w:bottom w:w="0" w:type="dxa"/>
-          </w:tblCellMar>
-        </w:tblPrEx>
         <w:tc>
           <w:tcPr>
             <w:tcW w:w="0" w:type="auto"/>
@@ -1159,12 +1073,6 @@
         <w:gridCol w:w="9360"/>
       </w:tblGrid>
       <w:tr>
-        <w:tblPrEx>
-          <w:tblCellMar>
-            <w:top w:w="0" w:type="dxa"/>
-            <w:bottom w:w="0" w:type="dxa"/>
-          </w:tblCellMar>
-        </w:tblPrEx>
         <w:tc>
           <w:tcPr>
             <w:tcW w:w="0" w:type="auto"/>
@@ -1227,12 +1135,6 @@
         <w:gridCol w:w="9360"/>
       </w:tblGrid>
       <w:tr>
-        <w:tblPrEx>
-          <w:tblCellMar>
-            <w:top w:w="0" w:type="dxa"/>
-            <w:bottom w:w="0" w:type="dxa"/>
-          </w:tblCellMar>
-        </w:tblPrEx>
         <w:tc>
           <w:tcPr>
             <w:tcW w:w="0" w:type="auto"/>
@@ -1292,21 +1194,7 @@
         <w:rPr>
           <w:color w:val="0F172A"/>
         </w:rPr>
-        <w:t xml:space="preserve">Every time a </w:t>
-      </w:r>
-      <w:proofErr w:type="gramStart"/>
-      <w:r>
-        <w:rPr>
-          <w:color w:val="0F172A"/>
-        </w:rPr>
-        <w:t>Manager</w:t>
-      </w:r>
-      <w:proofErr w:type="gramEnd"/>
-      <w:r>
-        <w:rPr>
-          <w:color w:val="0F172A"/>
-        </w:rPr>
-        <w:t xml:space="preserve"> tries to assign a staff member to a shift, the system checks all 8 rules simultaneously. It never stops at the first failure — it reports every issue at once so the Manager sees the full picture.</w:t>
+        <w:t>Every time a Manager tries to assign a staff member to a shift, the system checks all 8 rules simultaneously. It never stops at the first failure — it reports every issue at once so the Manager sees the full picture.</w:t>
       </w:r>
     </w:p>
     <w:p>
@@ -1336,12 +1224,6 @@
         <w:gridCol w:w="7544"/>
       </w:tblGrid>
       <w:tr>
-        <w:tblPrEx>
-          <w:tblCellMar>
-            <w:top w:w="0" w:type="dxa"/>
-            <w:bottom w:w="0" w:type="dxa"/>
-          </w:tblCellMar>
-        </w:tblPrEx>
         <w:tc>
           <w:tcPr>
             <w:tcW w:w="0" w:type="auto"/>
@@ -1402,12 +1284,6 @@
         </w:tc>
       </w:tr>
       <w:tr>
-        <w:tblPrEx>
-          <w:tblCellMar>
-            <w:top w:w="0" w:type="dxa"/>
-            <w:bottom w:w="0" w:type="dxa"/>
-          </w:tblCellMar>
-        </w:tblPrEx>
         <w:tc>
           <w:tcPr>
             <w:tcW w:w="0" w:type="auto"/>
@@ -1468,12 +1344,6 @@
         </w:tc>
       </w:tr>
       <w:tr>
-        <w:tblPrEx>
-          <w:tblCellMar>
-            <w:top w:w="0" w:type="dxa"/>
-            <w:bottom w:w="0" w:type="dxa"/>
-          </w:tblCellMar>
-        </w:tblPrEx>
         <w:tc>
           <w:tcPr>
             <w:tcW w:w="0" w:type="auto"/>
@@ -1534,12 +1404,6 @@
         </w:tc>
       </w:tr>
       <w:tr>
-        <w:tblPrEx>
-          <w:tblCellMar>
-            <w:top w:w="0" w:type="dxa"/>
-            <w:bottom w:w="0" w:type="dxa"/>
-          </w:tblCellMar>
-        </w:tblPrEx>
         <w:tc>
           <w:tcPr>
             <w:tcW w:w="0" w:type="auto"/>
@@ -1600,12 +1464,6 @@
         </w:tc>
       </w:tr>
       <w:tr>
-        <w:tblPrEx>
-          <w:tblCellMar>
-            <w:top w:w="0" w:type="dxa"/>
-            <w:bottom w:w="0" w:type="dxa"/>
-          </w:tblCellMar>
-        </w:tblPrEx>
         <w:tc>
           <w:tcPr>
             <w:tcW w:w="0" w:type="auto"/>
@@ -1666,12 +1524,6 @@
         </w:tc>
       </w:tr>
       <w:tr>
-        <w:tblPrEx>
-          <w:tblCellMar>
-            <w:top w:w="0" w:type="dxa"/>
-            <w:bottom w:w="0" w:type="dxa"/>
-          </w:tblCellMar>
-        </w:tblPrEx>
         <w:tc>
           <w:tcPr>
             <w:tcW w:w="0" w:type="auto"/>
@@ -1732,12 +1584,6 @@
         </w:tc>
       </w:tr>
       <w:tr>
-        <w:tblPrEx>
-          <w:tblCellMar>
-            <w:top w:w="0" w:type="dxa"/>
-            <w:bottom w:w="0" w:type="dxa"/>
-          </w:tblCellMar>
-        </w:tblPrEx>
         <w:tc>
           <w:tcPr>
             <w:tcW w:w="0" w:type="auto"/>
@@ -1798,12 +1644,6 @@
         </w:tc>
       </w:tr>
       <w:tr>
-        <w:tblPrEx>
-          <w:tblCellMar>
-            <w:top w:w="0" w:type="dxa"/>
-            <w:bottom w:w="0" w:type="dxa"/>
-          </w:tblCellMar>
-        </w:tblPrEx>
         <w:tc>
           <w:tcPr>
             <w:tcW w:w="0" w:type="auto"/>
@@ -1918,12 +1758,6 @@
         <w:gridCol w:w="9360"/>
       </w:tblGrid>
       <w:tr>
-        <w:tblPrEx>
-          <w:tblCellMar>
-            <w:top w:w="0" w:type="dxa"/>
-            <w:bottom w:w="0" w:type="dxa"/>
-          </w:tblCellMar>
-        </w:tblPrEx>
         <w:tc>
           <w:tcPr>
             <w:tcW w:w="0" w:type="auto"/>
@@ -2307,12 +2141,6 @@
         <w:gridCol w:w="9360"/>
       </w:tblGrid>
       <w:tr>
-        <w:tblPrEx>
-          <w:tblCellMar>
-            <w:top w:w="0" w:type="dxa"/>
-            <w:bottom w:w="0" w:type="dxa"/>
-          </w:tblCellMar>
-        </w:tblPrEx>
         <w:tc>
           <w:tcPr>
             <w:tcW w:w="0" w:type="auto"/>
@@ -2407,43 +2235,7 @@
                 <w:sz w:val="20"/>
                 <w:szCs w:val="20"/>
               </w:rPr>
-              <w:t xml:space="preserve">Manager B's request is rejected with HTTP 409. </w:t>
-            </w:r>
-            <w:proofErr w:type="gramStart"/>
-            <w:r>
-              <w:rPr>
-                <w:color w:val="0F172A"/>
-                <w:sz w:val="20"/>
-                <w:szCs w:val="20"/>
-              </w:rPr>
-              <w:t>A</w:t>
-            </w:r>
-            <w:proofErr w:type="gramEnd"/>
-            <w:r>
-              <w:rPr>
-                <w:color w:val="0F172A"/>
-                <w:sz w:val="20"/>
-                <w:szCs w:val="20"/>
-              </w:rPr>
-              <w:t xml:space="preserve"> '</w:t>
-            </w:r>
-            <w:proofErr w:type="gramStart"/>
-            <w:r>
-              <w:rPr>
-                <w:color w:val="0F172A"/>
-                <w:sz w:val="20"/>
-                <w:szCs w:val="20"/>
-              </w:rPr>
-              <w:t>assignment.conflict</w:t>
-            </w:r>
-            <w:proofErr w:type="gramEnd"/>
-            <w:r>
-              <w:rPr>
-                <w:color w:val="0F172A"/>
-                <w:sz w:val="20"/>
-                <w:szCs w:val="20"/>
-              </w:rPr>
-              <w:t>' WebSocket event is immediately pushed to Manager B's browser.</w:t>
+              <w:t>Manager B's request is rejected with HTTP 409. A 'assignment.conflict' WebSocket event is immediately pushed to Manager B's browser.</w:t>
             </w:r>
           </w:p>
           <w:p>
@@ -2547,21 +2339,7 @@
         <w:rPr>
           <w:color w:val="0F172A"/>
         </w:rPr>
-        <w:t>What-if preview: before confirming an assignment, manager sees 'current 38</w:t>
-      </w:r>
-      <w:proofErr w:type="gramStart"/>
-      <w:r>
-        <w:rPr>
-          <w:color w:val="0F172A"/>
-        </w:rPr>
-        <w:t>hrs  +</w:t>
-      </w:r>
-      <w:proofErr w:type="gramEnd"/>
-      <w:r>
-        <w:rPr>
-          <w:color w:val="0F172A"/>
-        </w:rPr>
-        <w:t xml:space="preserve"> this shift 6hrs = 44hrs projected. Overtime cost: $63.'</w:t>
+        <w:t>What-if preview: before confirming an assignment, manager sees 'current 38hrs  + this shift 6hrs = 44hrs projected. Overtime cost: $63.'</w:t>
       </w:r>
     </w:p>
     <w:p>
@@ -2696,12 +2474,6 @@
         <w:gridCol w:w="7918"/>
       </w:tblGrid>
       <w:tr>
-        <w:tblPrEx>
-          <w:tblCellMar>
-            <w:top w:w="0" w:type="dxa"/>
-            <w:bottom w:w="0" w:type="dxa"/>
-          </w:tblCellMar>
-        </w:tblPrEx>
         <w:tc>
           <w:tcPr>
             <w:tcW w:w="0" w:type="auto"/>
@@ -2762,12 +2534,6 @@
         </w:tc>
       </w:tr>
       <w:tr>
-        <w:tblPrEx>
-          <w:tblCellMar>
-            <w:top w:w="0" w:type="dxa"/>
-            <w:bottom w:w="0" w:type="dxa"/>
-          </w:tblCellMar>
-        </w:tblPrEx>
         <w:tc>
           <w:tcPr>
             <w:tcW w:w="0" w:type="auto"/>
@@ -2828,12 +2594,6 @@
         </w:tc>
       </w:tr>
       <w:tr>
-        <w:tblPrEx>
-          <w:tblCellMar>
-            <w:top w:w="0" w:type="dxa"/>
-            <w:bottom w:w="0" w:type="dxa"/>
-          </w:tblCellMar>
-        </w:tblPrEx>
         <w:tc>
           <w:tcPr>
             <w:tcW w:w="0" w:type="auto"/>
@@ -2925,12 +2685,6 @@
         <w:gridCol w:w="9360"/>
       </w:tblGrid>
       <w:tr>
-        <w:tblPrEx>
-          <w:tblCellMar>
-            <w:top w:w="0" w:type="dxa"/>
-            <w:bottom w:w="0" w:type="dxa"/>
-          </w:tblCellMar>
-        </w:tblPrEx>
         <w:tc>
           <w:tcPr>
             <w:tcW w:w="0" w:type="auto"/>
@@ -3025,12 +2779,6 @@
         <w:gridCol w:w="9360"/>
       </w:tblGrid>
       <w:tr>
-        <w:tblPrEx>
-          <w:tblCellMar>
-            <w:top w:w="0" w:type="dxa"/>
-            <w:bottom w:w="0" w:type="dxa"/>
-          </w:tblCellMar>
-        </w:tblPrEx>
         <w:tc>
           <w:tcPr>
             <w:tcW w:w="0" w:type="auto"/>
@@ -3090,12 +2838,6 @@
         <w:gridCol w:w="8753"/>
       </w:tblGrid>
       <w:tr>
-        <w:tblPrEx>
-          <w:tblCellMar>
-            <w:top w:w="0" w:type="dxa"/>
-            <w:bottom w:w="0" w:type="dxa"/>
-          </w:tblCellMar>
-        </w:tblPrEx>
         <w:tc>
           <w:tcPr>
             <w:tcW w:w="0" w:type="auto"/>
@@ -3202,12 +2944,6 @@
         <w:gridCol w:w="8753"/>
       </w:tblGrid>
       <w:tr>
-        <w:tblPrEx>
-          <w:tblCellMar>
-            <w:top w:w="0" w:type="dxa"/>
-            <w:bottom w:w="0" w:type="dxa"/>
-          </w:tblCellMar>
-        </w:tblPrEx>
         <w:tc>
           <w:tcPr>
             <w:tcW w:w="0" w:type="auto"/>
@@ -3314,12 +3050,6 @@
         <w:gridCol w:w="8753"/>
       </w:tblGrid>
       <w:tr>
-        <w:tblPrEx>
-          <w:tblCellMar>
-            <w:top w:w="0" w:type="dxa"/>
-            <w:bottom w:w="0" w:type="dxa"/>
-          </w:tblCellMar>
-        </w:tblPrEx>
         <w:tc>
           <w:tcPr>
             <w:tcW w:w="0" w:type="auto"/>
@@ -3425,12 +3155,6 @@
         <w:gridCol w:w="9360"/>
       </w:tblGrid>
       <w:tr>
-        <w:tblPrEx>
-          <w:tblCellMar>
-            <w:top w:w="0" w:type="dxa"/>
-            <w:bottom w:w="0" w:type="dxa"/>
-          </w:tblCellMar>
-        </w:tblPrEx>
         <w:tc>
           <w:tcPr>
             <w:tcW w:w="0" w:type="auto"/>
@@ -3490,12 +3214,6 @@
         <w:gridCol w:w="8753"/>
       </w:tblGrid>
       <w:tr>
-        <w:tblPrEx>
-          <w:tblCellMar>
-            <w:top w:w="0" w:type="dxa"/>
-            <w:bottom w:w="0" w:type="dxa"/>
-          </w:tblCellMar>
-        </w:tblPrEx>
         <w:tc>
           <w:tcPr>
             <w:tcW w:w="0" w:type="auto"/>
@@ -3602,12 +3320,6 @@
         <w:gridCol w:w="8753"/>
       </w:tblGrid>
       <w:tr>
-        <w:tblPrEx>
-          <w:tblCellMar>
-            <w:top w:w="0" w:type="dxa"/>
-            <w:bottom w:w="0" w:type="dxa"/>
-          </w:tblCellMar>
-        </w:tblPrEx>
         <w:tc>
           <w:tcPr>
             <w:tcW w:w="0" w:type="auto"/>
@@ -3714,12 +3426,6 @@
         <w:gridCol w:w="8753"/>
       </w:tblGrid>
       <w:tr>
-        <w:tblPrEx>
-          <w:tblCellMar>
-            <w:top w:w="0" w:type="dxa"/>
-            <w:bottom w:w="0" w:type="dxa"/>
-          </w:tblCellMar>
-        </w:tblPrEx>
         <w:tc>
           <w:tcPr>
             <w:tcW w:w="0" w:type="auto"/>
@@ -3827,12 +3533,6 @@
         <w:gridCol w:w="8753"/>
       </w:tblGrid>
       <w:tr>
-        <w:tblPrEx>
-          <w:tblCellMar>
-            <w:top w:w="0" w:type="dxa"/>
-            <w:bottom w:w="0" w:type="dxa"/>
-          </w:tblCellMar>
-        </w:tblPrEx>
         <w:tc>
           <w:tcPr>
             <w:tcW w:w="0" w:type="auto"/>
@@ -3939,12 +3639,6 @@
         <w:gridCol w:w="8753"/>
       </w:tblGrid>
       <w:tr>
-        <w:tblPrEx>
-          <w:tblCellMar>
-            <w:top w:w="0" w:type="dxa"/>
-            <w:bottom w:w="0" w:type="dxa"/>
-          </w:tblCellMar>
-        </w:tblPrEx>
         <w:tc>
           <w:tcPr>
             <w:tcW w:w="0" w:type="auto"/>
@@ -4050,12 +3744,6 @@
         <w:gridCol w:w="9360"/>
       </w:tblGrid>
       <w:tr>
-        <w:tblPrEx>
-          <w:tblCellMar>
-            <w:top w:w="0" w:type="dxa"/>
-            <w:bottom w:w="0" w:type="dxa"/>
-          </w:tblCellMar>
-        </w:tblPrEx>
         <w:tc>
           <w:tcPr>
             <w:tcW w:w="0" w:type="auto"/>
@@ -4115,12 +3803,6 @@
         <w:gridCol w:w="8753"/>
       </w:tblGrid>
       <w:tr>
-        <w:tblPrEx>
-          <w:tblCellMar>
-            <w:top w:w="0" w:type="dxa"/>
-            <w:bottom w:w="0" w:type="dxa"/>
-          </w:tblCellMar>
-        </w:tblPrEx>
         <w:tc>
           <w:tcPr>
             <w:tcW w:w="0" w:type="auto"/>
@@ -4227,12 +3909,6 @@
         <w:gridCol w:w="8608"/>
       </w:tblGrid>
       <w:tr>
-        <w:tblPrEx>
-          <w:tblCellMar>
-            <w:top w:w="0" w:type="dxa"/>
-            <w:bottom w:w="0" w:type="dxa"/>
-          </w:tblCellMar>
-        </w:tblPrEx>
         <w:tc>
           <w:tcPr>
             <w:tcW w:w="0" w:type="auto"/>
@@ -4338,12 +4014,6 @@
         <w:gridCol w:w="9360"/>
       </w:tblGrid>
       <w:tr>
-        <w:tblPrEx>
-          <w:tblCellMar>
-            <w:top w:w="0" w:type="dxa"/>
-            <w:bottom w:w="0" w:type="dxa"/>
-          </w:tblCellMar>
-        </w:tblPrEx>
         <w:tc>
           <w:tcPr>
             <w:tcW w:w="0" w:type="auto"/>
@@ -4403,12 +4073,6 @@
         <w:gridCol w:w="8608"/>
       </w:tblGrid>
       <w:tr>
-        <w:tblPrEx>
-          <w:tblCellMar>
-            <w:top w:w="0" w:type="dxa"/>
-            <w:bottom w:w="0" w:type="dxa"/>
-          </w:tblCellMar>
-        </w:tblPrEx>
         <w:tc>
           <w:tcPr>
             <w:tcW w:w="0" w:type="auto"/>
@@ -4515,12 +4179,6 @@
         <w:gridCol w:w="8608"/>
       </w:tblGrid>
       <w:tr>
-        <w:tblPrEx>
-          <w:tblCellMar>
-            <w:top w:w="0" w:type="dxa"/>
-            <w:bottom w:w="0" w:type="dxa"/>
-          </w:tblCellMar>
-        </w:tblPrEx>
         <w:tc>
           <w:tcPr>
             <w:tcW w:w="0" w:type="auto"/>
@@ -4626,12 +4284,6 @@
         <w:gridCol w:w="9360"/>
       </w:tblGrid>
       <w:tr>
-        <w:tblPrEx>
-          <w:tblCellMar>
-            <w:top w:w="0" w:type="dxa"/>
-            <w:bottom w:w="0" w:type="dxa"/>
-          </w:tblCellMar>
-        </w:tblPrEx>
         <w:tc>
           <w:tcPr>
             <w:tcW w:w="0" w:type="auto"/>
@@ -4691,12 +4343,6 @@
         <w:gridCol w:w="8608"/>
       </w:tblGrid>
       <w:tr>
-        <w:tblPrEx>
-          <w:tblCellMar>
-            <w:top w:w="0" w:type="dxa"/>
-            <w:bottom w:w="0" w:type="dxa"/>
-          </w:tblCellMar>
-        </w:tblPrEx>
         <w:tc>
           <w:tcPr>
             <w:tcW w:w="0" w:type="auto"/>
@@ -4804,12 +4450,6 @@
         <w:gridCol w:w="8608"/>
       </w:tblGrid>
       <w:tr>
-        <w:tblPrEx>
-          <w:tblCellMar>
-            <w:top w:w="0" w:type="dxa"/>
-            <w:bottom w:w="0" w:type="dxa"/>
-          </w:tblCellMar>
-        </w:tblPrEx>
         <w:tc>
           <w:tcPr>
             <w:tcW w:w="0" w:type="auto"/>
@@ -4915,12 +4555,6 @@
         <w:gridCol w:w="9360"/>
       </w:tblGrid>
       <w:tr>
-        <w:tblPrEx>
-          <w:tblCellMar>
-            <w:top w:w="0" w:type="dxa"/>
-            <w:bottom w:w="0" w:type="dxa"/>
-          </w:tblCellMar>
-        </w:tblPrEx>
         <w:tc>
           <w:tcPr>
             <w:tcW w:w="0" w:type="auto"/>
@@ -4980,12 +4614,6 @@
         <w:gridCol w:w="8608"/>
       </w:tblGrid>
       <w:tr>
-        <w:tblPrEx>
-          <w:tblCellMar>
-            <w:top w:w="0" w:type="dxa"/>
-            <w:bottom w:w="0" w:type="dxa"/>
-          </w:tblCellMar>
-        </w:tblPrEx>
         <w:tc>
           <w:tcPr>
             <w:tcW w:w="0" w:type="auto"/>
@@ -5092,12 +4720,6 @@
         <w:gridCol w:w="8608"/>
       </w:tblGrid>
       <w:tr>
-        <w:tblPrEx>
-          <w:tblCellMar>
-            <w:top w:w="0" w:type="dxa"/>
-            <w:bottom w:w="0" w:type="dxa"/>
-          </w:tblCellMar>
-        </w:tblPrEx>
         <w:tc>
           <w:tcPr>
             <w:tcW w:w="0" w:type="auto"/>
@@ -5208,12 +4830,6 @@
         <w:gridCol w:w="9360"/>
       </w:tblGrid>
       <w:tr>
-        <w:tblPrEx>
-          <w:tblCellMar>
-            <w:top w:w="0" w:type="dxa"/>
-            <w:bottom w:w="0" w:type="dxa"/>
-          </w:tblCellMar>
-        </w:tblPrEx>
         <w:tc>
           <w:tcPr>
             <w:tcW w:w="0" w:type="auto"/>
@@ -5308,12 +4924,6 @@
         <w:gridCol w:w="9360"/>
       </w:tblGrid>
       <w:tr>
-        <w:tblPrEx>
-          <w:tblCellMar>
-            <w:top w:w="0" w:type="dxa"/>
-            <w:bottom w:w="0" w:type="dxa"/>
-          </w:tblCellMar>
-        </w:tblPrEx>
         <w:tc>
           <w:tcPr>
             <w:tcW w:w="0" w:type="auto"/>
@@ -5373,12 +4983,6 @@
         <w:gridCol w:w="8912"/>
       </w:tblGrid>
       <w:tr>
-        <w:tblPrEx>
-          <w:tblCellMar>
-            <w:top w:w="0" w:type="dxa"/>
-            <w:bottom w:w="0" w:type="dxa"/>
-          </w:tblCellMar>
-        </w:tblPrEx>
         <w:tc>
           <w:tcPr>
             <w:tcW w:w="0" w:type="auto"/>
@@ -5615,25 +5219,7 @@
                 <w:szCs w:val="21"/>
               </w:rPr>
               <w:lastRenderedPageBreak/>
-              <w:t xml:space="preserve">fires. The transaction rolls back with a 23505 error. The API catches this and returns HTTP 409. </w:t>
-            </w:r>
-            <w:proofErr w:type="gramStart"/>
-            <w:r>
-              <w:rPr>
-                <w:color w:val="0F172A"/>
-                <w:sz w:val="21"/>
-                <w:szCs w:val="21"/>
-              </w:rPr>
-              <w:t>So</w:t>
-            </w:r>
-            <w:proofErr w:type="gramEnd"/>
-            <w:r>
-              <w:rPr>
-                <w:color w:val="0F172A"/>
-                <w:sz w:val="21"/>
-                <w:szCs w:val="21"/>
-              </w:rPr>
-              <w:t xml:space="preserve"> there are two lines of defense: the application-layer engine that gives you a good error message, and the database constraint that is the final absolute truth.</w:t>
+              <w:t>fires. The transaction rolls back with a 23505 error. The API catches this and returns HTTP 409. So there are two lines of defense: the application-layer engine that gives you a good error message, and the database constraint that is the final absolute truth.</w:t>
             </w:r>
           </w:p>
           <w:p>
@@ -5651,27 +5237,7 @@
                 <w:sz w:val="18"/>
                 <w:szCs w:val="18"/>
               </w:rPr>
-              <w:t>BEGIN; SELECT pg_advisory_xact_lock(hashtext</w:t>
-            </w:r>
-            <w:proofErr w:type="gramStart"/>
-            <w:r>
-              <w:rPr>
-                <w:rFonts w:ascii="Courier New" w:eastAsia="Courier New" w:hAnsi="Courier New" w:cs="Courier New"/>
-                <w:color w:val="1E40AF"/>
-                <w:sz w:val="18"/>
-                <w:szCs w:val="18"/>
-              </w:rPr>
-              <w:t>(:userId</w:t>
-            </w:r>
-            <w:proofErr w:type="gramEnd"/>
-            <w:r>
-              <w:rPr>
-                <w:rFonts w:ascii="Courier New" w:eastAsia="Courier New" w:hAnsi="Courier New" w:cs="Courier New"/>
-                <w:color w:val="1E40AF"/>
-                <w:sz w:val="18"/>
-                <w:szCs w:val="18"/>
-              </w:rPr>
-              <w:t>)); -- re-read assignments inside lock -- INSERT shift_assignments (fires UNIQUE constraint as backstop); INSERT audit_logs (...); INSERT notifications (...); COMMIT; -- WebSocket emit AFTER commit</w:t>
+              <w:t>BEGIN; SELECT pg_advisory_xact_lock(hashtext(:userId)); -- re-read assignments inside lock -- INSERT shift_assignments (fires UNIQUE constraint as backstop); INSERT audit_logs (...); INSERT notifications (...); COMMIT; -- WebSocket emit AFTER commit</w:t>
             </w:r>
           </w:p>
           <w:p>
@@ -5716,12 +5282,6 @@
         <w:gridCol w:w="9360"/>
       </w:tblGrid>
       <w:tr>
-        <w:tblPrEx>
-          <w:tblCellMar>
-            <w:top w:w="0" w:type="dxa"/>
-            <w:bottom w:w="0" w:type="dxa"/>
-          </w:tblCellMar>
-        </w:tblPrEx>
         <w:tc>
           <w:tcPr>
             <w:tcW w:w="0" w:type="auto"/>
@@ -5781,12 +5341,6 @@
         <w:gridCol w:w="8912"/>
       </w:tblGrid>
       <w:tr>
-        <w:tblPrEx>
-          <w:tblCellMar>
-            <w:top w:w="0" w:type="dxa"/>
-            <w:bottom w:w="0" w:type="dxa"/>
-          </w:tblCellMar>
-        </w:tblPrEx>
         <w:tc>
           <w:tcPr>
             <w:tcW w:w="0" w:type="auto"/>
@@ -5876,25 +5430,59 @@
                 <w:sz w:val="21"/>
                 <w:szCs w:val="21"/>
               </w:rPr>
-              <w:t xml:space="preserve">The schema has a </w:t>
-            </w:r>
-            <w:proofErr w:type="gramStart"/>
-            <w:r>
-              <w:rPr>
-                <w:color w:val="0F172A"/>
-                <w:sz w:val="21"/>
-                <w:szCs w:val="21"/>
-              </w:rPr>
-              <w:t>UNIQUE(</w:t>
-            </w:r>
-            <w:proofErr w:type="gramEnd"/>
-            <w:r>
-              <w:rPr>
-                <w:color w:val="0F172A"/>
-                <w:sz w:val="21"/>
-                <w:szCs w:val="21"/>
-              </w:rPr>
-              <w:t>shift_id, user_id) constraint on shift_assignments. This means for any given shift, a user can appear exactly once. The UNIQUE constraint is enforced at the transaction commit level by the database engine itself — it is not possible to insert two rows with the same shift_id and user_id in the same or concurrent transactions.</w:t>
+              <w:t>The schema has a UNIQUE</w:t>
+            </w:r>
+            <w:r>
+              <w:rPr>
+                <w:color w:val="0F172A"/>
+                <w:sz w:val="21"/>
+                <w:szCs w:val="21"/>
+              </w:rPr>
+              <w:t xml:space="preserve"> </w:t>
+            </w:r>
+            <w:r>
+              <w:rPr>
+                <w:color w:val="0F172A"/>
+                <w:sz w:val="21"/>
+                <w:szCs w:val="21"/>
+              </w:rPr>
+              <w:t>(</w:t>
+            </w:r>
+            <w:proofErr w:type="spellStart"/>
+            <w:r>
+              <w:rPr>
+                <w:color w:val="0F172A"/>
+                <w:sz w:val="21"/>
+                <w:szCs w:val="21"/>
+              </w:rPr>
+              <w:t>shift_id</w:t>
+            </w:r>
+            <w:proofErr w:type="spellEnd"/>
+            <w:r>
+              <w:rPr>
+                <w:color w:val="0F172A"/>
+                <w:sz w:val="21"/>
+                <w:szCs w:val="21"/>
+              </w:rPr>
+              <w:t xml:space="preserve">, </w:t>
+            </w:r>
+            <w:proofErr w:type="spellStart"/>
+            <w:r>
+              <w:rPr>
+                <w:color w:val="0F172A"/>
+                <w:sz w:val="21"/>
+                <w:szCs w:val="21"/>
+              </w:rPr>
+              <w:t>user_id</w:t>
+            </w:r>
+            <w:proofErr w:type="spellEnd"/>
+            <w:r>
+              <w:rPr>
+                <w:color w:val="0F172A"/>
+                <w:sz w:val="21"/>
+                <w:szCs w:val="21"/>
+              </w:rPr>
+              <w:t>) constraint on shift_assignments. This means for any given shift, a user can appear exactly once. The UNIQUE constraint is enforced at the transaction commit level by the database engine itself — it is not possible to insert two rows with the same shift_id and user_id in the same or concurrent transactions.</w:t>
             </w:r>
           </w:p>
           <w:p>
@@ -5970,12 +5558,6 @@
         <w:gridCol w:w="9360"/>
       </w:tblGrid>
       <w:tr>
-        <w:tblPrEx>
-          <w:tblCellMar>
-            <w:top w:w="0" w:type="dxa"/>
-            <w:bottom w:w="0" w:type="dxa"/>
-          </w:tblCellMar>
-        </w:tblPrEx>
         <w:tc>
           <w:tcPr>
             <w:tcW w:w="0" w:type="auto"/>
@@ -6035,12 +5617,6 @@
         <w:gridCol w:w="8912"/>
       </w:tblGrid>
       <w:tr>
-        <w:tblPrEx>
-          <w:tblCellMar>
-            <w:top w:w="0" w:type="dxa"/>
-            <w:bottom w:w="0" w:type="dxa"/>
-          </w:tblCellMar>
-        </w:tblPrEx>
         <w:tc>
           <w:tcPr>
             <w:tcW w:w="0" w:type="auto"/>
@@ -6149,7 +5725,7 @@
                 <w:szCs w:val="18"/>
               </w:rPr>
               <w:lastRenderedPageBreak/>
-              <w:t>'Carlos Rivera\\'s previous shift ends at 23:00 on Aug 10. This shift starts at 07:00 on Aug 11. Gap: 8 hours. Minimum required: 10 hours. Shortfall: 2 hours.'</w:t>
+              <w:t>'Carlos Rivera's previous shift ends at 23:00 on Aug 10. This shift starts at 07:00 on Aug 11. Gap: 8 hours. Minimum required: 10 hours. Shortfall: 2 hours.'</w:t>
             </w:r>
           </w:p>
           <w:p>
@@ -6162,25 +5738,7 @@
                 <w:sz w:val="21"/>
                 <w:szCs w:val="21"/>
               </w:rPr>
-              <w:t xml:space="preserve">The API returns this inside a structured error with code CONSTRAINT_VIOLATION, a details array containing all violations, and a suggestions array. The suggestions array is populated by </w:t>
-            </w:r>
-            <w:proofErr w:type="spellStart"/>
-            <w:r>
-              <w:rPr>
-                <w:color w:val="0F172A"/>
-                <w:sz w:val="21"/>
-                <w:szCs w:val="21"/>
-              </w:rPr>
-              <w:t>SchedulingService</w:t>
-            </w:r>
-            <w:proofErr w:type="spellEnd"/>
-            <w:r>
-              <w:rPr>
-                <w:color w:val="0F172A"/>
-                <w:sz w:val="21"/>
-                <w:szCs w:val="21"/>
-              </w:rPr>
-              <w:t xml:space="preserve"> after the engine returns — it runs a separate query to find staff who have the required skill, an active cert at this location, pass the same availability check for this shift, and have no constraint violations. This query is the same constraint engine logic but evaluated in bulk for all candidates and filtered to those who pass.</w:t>
+              <w:t>The API returns this inside a structured error with code CONSTRAINT_VIOLATION, a details array containing all violations, and a suggestions array. The suggestions array is populated by SchedulingService after the engine returns — it runs a separate query to find staff who have the required skill, an active cert at this location, pass the same availability check for this shift, and have no constraint violations. This query is the same constraint engine logic but evaluated in bulk for all candidates and filtered to those who pass.</w:t>
             </w:r>
           </w:p>
           <w:p>
@@ -6238,12 +5796,6 @@
         <w:gridCol w:w="9360"/>
       </w:tblGrid>
       <w:tr>
-        <w:tblPrEx>
-          <w:tblCellMar>
-            <w:top w:w="0" w:type="dxa"/>
-            <w:bottom w:w="0" w:type="dxa"/>
-          </w:tblCellMar>
-        </w:tblPrEx>
         <w:tc>
           <w:tcPr>
             <w:tcW w:w="0" w:type="auto"/>
@@ -6303,12 +5855,6 @@
         <w:gridCol w:w="8912"/>
       </w:tblGrid>
       <w:tr>
-        <w:tblPrEx>
-          <w:tblCellMar>
-            <w:top w:w="0" w:type="dxa"/>
-            <w:bottom w:w="0" w:type="dxa"/>
-          </w:tblCellMar>
-        </w:tblPrEx>
         <w:tc>
           <w:tcPr>
             <w:tcW w:w="0" w:type="auto"/>
@@ -6530,9 +6076,9 @@
                 <w:sz w:val="18"/>
                 <w:szCs w:val="18"/>
               </w:rPr>
-              <w:t xml:space="preserve">, date}, </w:t>
-            </w:r>
-            <w:proofErr w:type="gramStart"/>
+              <w:t>, date}, ...]\</w:t>
+            </w:r>
+            <w:proofErr w:type="spellStart"/>
             <w:r>
               <w:rPr>
                 <w:rFonts w:ascii="Courier New" w:eastAsia="Courier New" w:hAnsi="Courier New" w:cs="Courier New"/>
@@ -6540,10 +6086,9 @@
                 <w:sz w:val="18"/>
                 <w:szCs w:val="18"/>
               </w:rPr>
-              <w:t>...]\</w:t>
-            </w:r>
-            <w:proofErr w:type="spellStart"/>
-            <w:proofErr w:type="gramEnd"/>
+              <w:t>nfor</w:t>
+            </w:r>
+            <w:proofErr w:type="spellEnd"/>
             <w:r>
               <w:rPr>
                 <w:rFonts w:ascii="Courier New" w:eastAsia="Courier New" w:hAnsi="Courier New" w:cs="Courier New"/>
@@ -6551,9 +6096,9 @@
                 <w:sz w:val="18"/>
                 <w:szCs w:val="18"/>
               </w:rPr>
-              <w:t>nfor</w:t>
-            </w:r>
-            <w:proofErr w:type="spellEnd"/>
+              <w:t xml:space="preserve"> (const segment of segments) {\n  const </w:t>
+            </w:r>
+            <w:proofErr w:type="spellStart"/>
             <w:r>
               <w:rPr>
                 <w:rFonts w:ascii="Courier New" w:eastAsia="Courier New" w:hAnsi="Courier New" w:cs="Courier New"/>
@@ -6561,9 +6106,9 @@
                 <w:sz w:val="18"/>
                 <w:szCs w:val="18"/>
               </w:rPr>
-              <w:t xml:space="preserve"> (const segment of segments) {\</w:t>
-            </w:r>
-            <w:proofErr w:type="gramStart"/>
+              <w:t>dayOfWeek</w:t>
+            </w:r>
+            <w:proofErr w:type="spellEnd"/>
             <w:r>
               <w:rPr>
                 <w:rFonts w:ascii="Courier New" w:eastAsia="Courier New" w:hAnsi="Courier New" w:cs="Courier New"/>
@@ -6571,9 +6116,9 @@
                 <w:sz w:val="18"/>
                 <w:szCs w:val="18"/>
               </w:rPr>
-              <w:t>n  const</w:t>
-            </w:r>
-            <w:proofErr w:type="gramEnd"/>
+              <w:t xml:space="preserve"> = </w:t>
+            </w:r>
+            <w:proofErr w:type="spellStart"/>
             <w:r>
               <w:rPr>
                 <w:rFonts w:ascii="Courier New" w:eastAsia="Courier New" w:hAnsi="Courier New" w:cs="Courier New"/>
@@ -6581,9 +6126,9 @@
                 <w:sz w:val="18"/>
                 <w:szCs w:val="18"/>
               </w:rPr>
-              <w:t xml:space="preserve"> </w:t>
-            </w:r>
-            <w:proofErr w:type="spellStart"/>
+              <w:t>getDayInUserTimezone</w:t>
+            </w:r>
+            <w:proofErr w:type="spellEnd"/>
             <w:r>
               <w:rPr>
                 <w:rFonts w:ascii="Courier New" w:eastAsia="Courier New" w:hAnsi="Courier New" w:cs="Courier New"/>
@@ -6591,9 +6136,9 @@
                 <w:sz w:val="18"/>
                 <w:szCs w:val="18"/>
               </w:rPr>
-              <w:t>dayOfWeek</w:t>
-            </w:r>
-            <w:proofErr w:type="spellEnd"/>
+              <w:t>(</w:t>
+            </w:r>
+            <w:proofErr w:type="spellStart"/>
             <w:r>
               <w:rPr>
                 <w:rFonts w:ascii="Courier New" w:eastAsia="Courier New" w:hAnsi="Courier New" w:cs="Courier New"/>
@@ -6601,10 +6146,9 @@
                 <w:sz w:val="18"/>
                 <w:szCs w:val="18"/>
               </w:rPr>
-              <w:t xml:space="preserve"> = </w:t>
-            </w:r>
-            <w:proofErr w:type="spellStart"/>
-            <w:proofErr w:type="gramStart"/>
+              <w:t>segment.startUtc</w:t>
+            </w:r>
+            <w:proofErr w:type="spellEnd"/>
             <w:r>
               <w:rPr>
                 <w:rFonts w:ascii="Courier New" w:eastAsia="Courier New" w:hAnsi="Courier New" w:cs="Courier New"/>
@@ -6612,9 +6156,9 @@
                 <w:sz w:val="18"/>
                 <w:szCs w:val="18"/>
               </w:rPr>
-              <w:t>getDayInUserTimezone</w:t>
-            </w:r>
-            <w:proofErr w:type="spellEnd"/>
+              <w:t xml:space="preserve">, </w:t>
+            </w:r>
+            <w:proofErr w:type="spellStart"/>
             <w:r>
               <w:rPr>
                 <w:rFonts w:ascii="Courier New" w:eastAsia="Courier New" w:hAnsi="Courier New" w:cs="Courier New"/>
@@ -6622,9 +6166,9 @@
                 <w:sz w:val="18"/>
                 <w:szCs w:val="18"/>
               </w:rPr>
-              <w:t>(</w:t>
-            </w:r>
-            <w:proofErr w:type="spellStart"/>
+              <w:t>user.homeTimezone</w:t>
+            </w:r>
+            <w:proofErr w:type="spellEnd"/>
             <w:r>
               <w:rPr>
                 <w:rFonts w:ascii="Courier New" w:eastAsia="Courier New" w:hAnsi="Courier New" w:cs="Courier New"/>
@@ -6632,10 +6176,9 @@
                 <w:sz w:val="18"/>
                 <w:szCs w:val="18"/>
               </w:rPr>
-              <w:t>segment.startUtc</w:t>
-            </w:r>
-            <w:proofErr w:type="spellEnd"/>
-            <w:proofErr w:type="gramEnd"/>
+              <w:t xml:space="preserve">);\n  const window = </w:t>
+            </w:r>
+            <w:proofErr w:type="spellStart"/>
             <w:r>
               <w:rPr>
                 <w:rFonts w:ascii="Courier New" w:eastAsia="Courier New" w:hAnsi="Courier New" w:cs="Courier New"/>
@@ -6643,10 +6186,9 @@
                 <w:sz w:val="18"/>
                 <w:szCs w:val="18"/>
               </w:rPr>
-              <w:t xml:space="preserve">, </w:t>
-            </w:r>
-            <w:proofErr w:type="spellStart"/>
-            <w:proofErr w:type="gramStart"/>
+              <w:t>resolveAvailabilityWindow</w:t>
+            </w:r>
+            <w:proofErr w:type="spellEnd"/>
             <w:r>
               <w:rPr>
                 <w:rFonts w:ascii="Courier New" w:eastAsia="Courier New" w:hAnsi="Courier New" w:cs="Courier New"/>
@@ -6654,9 +6196,9 @@
                 <w:sz w:val="18"/>
                 <w:szCs w:val="18"/>
               </w:rPr>
-              <w:t>user.homeTimezone</w:t>
-            </w:r>
-            <w:proofErr w:type="spellEnd"/>
+              <w:t xml:space="preserve">(user, </w:t>
+            </w:r>
+            <w:proofErr w:type="spellStart"/>
             <w:r>
               <w:rPr>
                 <w:rFonts w:ascii="Courier New" w:eastAsia="Courier New" w:hAnsi="Courier New" w:cs="Courier New"/>
@@ -6664,9 +6206,9 @@
                 <w:sz w:val="18"/>
                 <w:szCs w:val="18"/>
               </w:rPr>
-              <w:t>);\n  const</w:t>
-            </w:r>
-            <w:proofErr w:type="gramEnd"/>
+              <w:t>dayOfWeek</w:t>
+            </w:r>
+            <w:proofErr w:type="spellEnd"/>
             <w:r>
               <w:rPr>
                 <w:rFonts w:ascii="Courier New" w:eastAsia="Courier New" w:hAnsi="Courier New" w:cs="Courier New"/>
@@ -6674,10 +6216,9 @@
                 <w:sz w:val="18"/>
                 <w:szCs w:val="18"/>
               </w:rPr>
-              <w:t xml:space="preserve"> window = </w:t>
+              <w:t xml:space="preserve">, </w:t>
             </w:r>
             <w:proofErr w:type="spellStart"/>
-            <w:proofErr w:type="gramStart"/>
             <w:r>
               <w:rPr>
                 <w:rFonts w:ascii="Courier New" w:eastAsia="Courier New" w:hAnsi="Courier New" w:cs="Courier New"/>
@@ -6685,7 +6226,7 @@
                 <w:sz w:val="18"/>
                 <w:szCs w:val="18"/>
               </w:rPr>
-              <w:t>resolveAvailabilityWindow</w:t>
+              <w:t>segment.date</w:t>
             </w:r>
             <w:proofErr w:type="spellEnd"/>
             <w:r>
@@ -6695,9 +6236,9 @@
                 <w:sz w:val="18"/>
                 <w:szCs w:val="18"/>
               </w:rPr>
-              <w:t>(</w:t>
-            </w:r>
-            <w:proofErr w:type="gramEnd"/>
+              <w:t>);\n  if (</w:t>
+            </w:r>
+            <w:proofErr w:type="spellStart"/>
             <w:r>
               <w:rPr>
                 <w:rFonts w:ascii="Courier New" w:eastAsia="Courier New" w:hAnsi="Courier New" w:cs="Courier New"/>
@@ -6705,9 +6246,9 @@
                 <w:sz w:val="18"/>
                 <w:szCs w:val="18"/>
               </w:rPr>
-              <w:t xml:space="preserve">user, </w:t>
-            </w:r>
-            <w:proofErr w:type="spellStart"/>
+              <w:t>segment.startUtc</w:t>
+            </w:r>
+            <w:proofErr w:type="spellEnd"/>
             <w:r>
               <w:rPr>
                 <w:rFonts w:ascii="Courier New" w:eastAsia="Courier New" w:hAnsi="Courier New" w:cs="Courier New"/>
@@ -6715,9 +6256,9 @@
                 <w:sz w:val="18"/>
                 <w:szCs w:val="18"/>
               </w:rPr>
-              <w:t>dayOfWeek</w:t>
-            </w:r>
-            <w:proofErr w:type="spellEnd"/>
+              <w:t xml:space="preserve"> &lt; </w:t>
+            </w:r>
+            <w:proofErr w:type="spellStart"/>
             <w:r>
               <w:rPr>
                 <w:rFonts w:ascii="Courier New" w:eastAsia="Courier New" w:hAnsi="Courier New" w:cs="Courier New"/>
@@ -6725,10 +6266,9 @@
                 <w:sz w:val="18"/>
                 <w:szCs w:val="18"/>
               </w:rPr>
-              <w:t xml:space="preserve">, </w:t>
-            </w:r>
-            <w:proofErr w:type="spellStart"/>
-            <w:proofErr w:type="gramStart"/>
+              <w:t>window.start</w:t>
+            </w:r>
+            <w:proofErr w:type="spellEnd"/>
             <w:r>
               <w:rPr>
                 <w:rFonts w:ascii="Courier New" w:eastAsia="Courier New" w:hAnsi="Courier New" w:cs="Courier New"/>
@@ -6736,9 +6276,9 @@
                 <w:sz w:val="18"/>
                 <w:szCs w:val="18"/>
               </w:rPr>
-              <w:t>segment.date</w:t>
-            </w:r>
-            <w:proofErr w:type="spellEnd"/>
+              <w:t xml:space="preserve"> || </w:t>
+            </w:r>
+            <w:proofErr w:type="spellStart"/>
             <w:r>
               <w:rPr>
                 <w:rFonts w:ascii="Courier New" w:eastAsia="Courier New" w:hAnsi="Courier New" w:cs="Courier New"/>
@@ -6746,9 +6286,9 @@
                 <w:sz w:val="18"/>
                 <w:szCs w:val="18"/>
               </w:rPr>
-              <w:t>);\n  if</w:t>
-            </w:r>
-            <w:proofErr w:type="gramEnd"/>
+              <w:t>segment.endUtc</w:t>
+            </w:r>
+            <w:proofErr w:type="spellEnd"/>
             <w:r>
               <w:rPr>
                 <w:rFonts w:ascii="Courier New" w:eastAsia="Courier New" w:hAnsi="Courier New" w:cs="Courier New"/>
@@ -6756,10 +6296,9 @@
                 <w:sz w:val="18"/>
                 <w:szCs w:val="18"/>
               </w:rPr>
-              <w:t xml:space="preserve"> (</w:t>
+              <w:t xml:space="preserve"> &gt; </w:t>
             </w:r>
             <w:proofErr w:type="spellStart"/>
-            <w:proofErr w:type="gramStart"/>
             <w:r>
               <w:rPr>
                 <w:rFonts w:ascii="Courier New" w:eastAsia="Courier New" w:hAnsi="Courier New" w:cs="Courier New"/>
@@ -6767,10 +6306,9 @@
                 <w:sz w:val="18"/>
                 <w:szCs w:val="18"/>
               </w:rPr>
-              <w:t>segment.startUtc</w:t>
+              <w:t>window.end</w:t>
             </w:r>
             <w:proofErr w:type="spellEnd"/>
-            <w:proofErr w:type="gramEnd"/>
             <w:r>
               <w:rPr>
                 <w:rFonts w:ascii="Courier New" w:eastAsia="Courier New" w:hAnsi="Courier New" w:cs="Courier New"/>
@@ -6778,91 +6316,7 @@
                 <w:sz w:val="18"/>
                 <w:szCs w:val="18"/>
               </w:rPr>
-              <w:t xml:space="preserve"> &lt; </w:t>
-            </w:r>
-            <w:proofErr w:type="spellStart"/>
-            <w:proofErr w:type="gramStart"/>
-            <w:r>
-              <w:rPr>
-                <w:rFonts w:ascii="Courier New" w:eastAsia="Courier New" w:hAnsi="Courier New" w:cs="Courier New"/>
-                <w:color w:val="1E40AF"/>
-                <w:sz w:val="18"/>
-                <w:szCs w:val="18"/>
-              </w:rPr>
-              <w:t>window.start</w:t>
-            </w:r>
-            <w:proofErr w:type="spellEnd"/>
-            <w:proofErr w:type="gramEnd"/>
-            <w:r>
-              <w:rPr>
-                <w:rFonts w:ascii="Courier New" w:eastAsia="Courier New" w:hAnsi="Courier New" w:cs="Courier New"/>
-                <w:color w:val="1E40AF"/>
-                <w:sz w:val="18"/>
-                <w:szCs w:val="18"/>
-              </w:rPr>
-              <w:t xml:space="preserve"> || </w:t>
-            </w:r>
-            <w:proofErr w:type="spellStart"/>
-            <w:proofErr w:type="gramStart"/>
-            <w:r>
-              <w:rPr>
-                <w:rFonts w:ascii="Courier New" w:eastAsia="Courier New" w:hAnsi="Courier New" w:cs="Courier New"/>
-                <w:color w:val="1E40AF"/>
-                <w:sz w:val="18"/>
-                <w:szCs w:val="18"/>
-              </w:rPr>
-              <w:t>segment.endUtc</w:t>
-            </w:r>
-            <w:proofErr w:type="spellEnd"/>
-            <w:proofErr w:type="gramEnd"/>
-            <w:r>
-              <w:rPr>
-                <w:rFonts w:ascii="Courier New" w:eastAsia="Courier New" w:hAnsi="Courier New" w:cs="Courier New"/>
-                <w:color w:val="1E40AF"/>
-                <w:sz w:val="18"/>
-                <w:szCs w:val="18"/>
-              </w:rPr>
-              <w:t xml:space="preserve"> &gt; </w:t>
-            </w:r>
-            <w:proofErr w:type="spellStart"/>
-            <w:r>
-              <w:rPr>
-                <w:rFonts w:ascii="Courier New" w:eastAsia="Courier New" w:hAnsi="Courier New" w:cs="Courier New"/>
-                <w:color w:val="1E40AF"/>
-                <w:sz w:val="18"/>
-                <w:szCs w:val="18"/>
-              </w:rPr>
-              <w:t>window.end</w:t>
-            </w:r>
-            <w:proofErr w:type="spellEnd"/>
-            <w:r>
-              <w:rPr>
-                <w:rFonts w:ascii="Courier New" w:eastAsia="Courier New" w:hAnsi="Courier New" w:cs="Courier New"/>
-                <w:color w:val="1E40AF"/>
-                <w:sz w:val="18"/>
-                <w:szCs w:val="18"/>
-              </w:rPr>
-              <w:t>) {\n    // violation\</w:t>
-            </w:r>
-            <w:proofErr w:type="gramStart"/>
-            <w:r>
-              <w:rPr>
-                <w:rFonts w:ascii="Courier New" w:eastAsia="Courier New" w:hAnsi="Courier New" w:cs="Courier New"/>
-                <w:color w:val="1E40AF"/>
-                <w:sz w:val="18"/>
-                <w:szCs w:val="18"/>
-              </w:rPr>
-              <w:t>n  }</w:t>
-            </w:r>
-            <w:proofErr w:type="gramEnd"/>
-            <w:r>
-              <w:rPr>
-                <w:rFonts w:ascii="Courier New" w:eastAsia="Courier New" w:hAnsi="Courier New" w:cs="Courier New"/>
-                <w:color w:val="1E40AF"/>
-                <w:sz w:val="18"/>
-                <w:szCs w:val="18"/>
-              </w:rPr>
-              <w:t>\n}</w:t>
+              <w:t>) {\n    // violation\n  }\n}</w:t>
             </w:r>
           </w:p>
           <w:p>
@@ -7010,12 +6464,6 @@
         <w:gridCol w:w="9360"/>
       </w:tblGrid>
       <w:tr>
-        <w:tblPrEx>
-          <w:tblCellMar>
-            <w:top w:w="0" w:type="dxa"/>
-            <w:bottom w:w="0" w:type="dxa"/>
-          </w:tblCellMar>
-        </w:tblPrEx>
         <w:tc>
           <w:tcPr>
             <w:tcW w:w="0" w:type="auto"/>
@@ -7075,12 +6523,6 @@
         <w:gridCol w:w="8912"/>
       </w:tblGrid>
       <w:tr>
-        <w:tblPrEx>
-          <w:tblCellMar>
-            <w:top w:w="0" w:type="dxa"/>
-            <w:bottom w:w="0" w:type="dxa"/>
-          </w:tblCellMar>
-        </w:tblPrEx>
         <w:tc>
           <w:tcPr>
             <w:tcW w:w="0" w:type="auto"/>
@@ -7171,7 +6613,25 @@
                 <w:sz w:val="21"/>
                 <w:szCs w:val="21"/>
               </w:rPr>
-              <w:t>Carlos has home_timezone = 'America/</w:t>
+              <w:t xml:space="preserve">Carlos has </w:t>
+            </w:r>
+            <w:proofErr w:type="spellStart"/>
+            <w:r>
+              <w:rPr>
+                <w:color w:val="0F172A"/>
+                <w:sz w:val="21"/>
+                <w:szCs w:val="21"/>
+              </w:rPr>
+              <w:t>home_timezone</w:t>
+            </w:r>
+            <w:proofErr w:type="spellEnd"/>
+            <w:r>
+              <w:rPr>
+                <w:color w:val="0F172A"/>
+                <w:sz w:val="21"/>
+                <w:szCs w:val="21"/>
+              </w:rPr>
+              <w:t xml:space="preserve"> = 'America/</w:t>
             </w:r>
             <w:proofErr w:type="spellStart"/>
             <w:r>
@@ -7313,7 +6773,6 @@
               <w:t xml:space="preserve">The availability check: what day is 13:00 UTC in Carlos's home timezone? </w:t>
             </w:r>
             <w:proofErr w:type="spellStart"/>
-            <w:proofErr w:type="gramStart"/>
             <w:r>
               <w:rPr>
                 <w:color w:val="0F172A"/>
@@ -7329,16 +6788,7 @@
                 <w:sz w:val="20"/>
                 <w:szCs w:val="20"/>
               </w:rPr>
-              <w:t>(</w:t>
-            </w:r>
-            <w:proofErr w:type="gramEnd"/>
-            <w:r>
-              <w:rPr>
-                <w:color w:val="0F172A"/>
-                <w:sz w:val="20"/>
-                <w:szCs w:val="20"/>
-              </w:rPr>
-              <w:t>'2025-08-11T13:00:00Z', 'America/</w:t>
+              <w:t>('2025-08-11T13:00:00Z', 'America/</w:t>
             </w:r>
             <w:proofErr w:type="spellStart"/>
             <w:r>
@@ -7377,7 +6827,6 @@
               <w:t xml:space="preserve">Carlos's available window on Monday starts at 09:00 PT = </w:t>
             </w:r>
             <w:proofErr w:type="spellStart"/>
-            <w:proofErr w:type="gramStart"/>
             <w:r>
               <w:rPr>
                 <w:color w:val="0F172A"/>
@@ -7393,16 +6842,7 @@
                 <w:sz w:val="20"/>
                 <w:szCs w:val="20"/>
               </w:rPr>
-              <w:t>(</w:t>
-            </w:r>
-            <w:proofErr w:type="gramEnd"/>
-            <w:r>
-              <w:rPr>
-                <w:color w:val="0F172A"/>
-                <w:sz w:val="20"/>
-                <w:szCs w:val="20"/>
-              </w:rPr>
-              <w:t>'2025-08-11T09:00', 'America/</w:t>
+              <w:t>('2025-08-11T09:00', 'America/</w:t>
             </w:r>
             <w:proofErr w:type="spellStart"/>
             <w:r>
@@ -7496,12 +6936,6 @@
         <w:gridCol w:w="9360"/>
       </w:tblGrid>
       <w:tr>
-        <w:tblPrEx>
-          <w:tblCellMar>
-            <w:top w:w="0" w:type="dxa"/>
-            <w:bottom w:w="0" w:type="dxa"/>
-          </w:tblCellMar>
-        </w:tblPrEx>
         <w:tc>
           <w:tcPr>
             <w:tcW w:w="0" w:type="auto"/>
@@ -7561,12 +6995,6 @@
         <w:gridCol w:w="8912"/>
       </w:tblGrid>
       <w:tr>
-        <w:tblPrEx>
-          <w:tblCellMar>
-            <w:top w:w="0" w:type="dxa"/>
-            <w:bottom w:w="0" w:type="dxa"/>
-          </w:tblCellMar>
-        </w:tblPrEx>
         <w:tc>
           <w:tcPr>
             <w:tcW w:w="0" w:type="auto"/>
@@ -7852,9 +7280,8 @@
                 <w:szCs w:val="18"/>
               </w:rPr>
               <w:lastRenderedPageBreak/>
-              <w:t>INSERT INTO audit_logs (...);\n  -- Notifications for Staff B and Manager\n  INSERT INTO notifications (...) x2;\</w:t>
-            </w:r>
-            <w:proofErr w:type="spellStart"/>
+              <w:t>INSERT INTO audit_logs (...);\n  -- Notifications for Staff B and Manager\n  INSERT INTO notifications (...) x2;</w:t>
+            </w:r>
             <w:r>
               <w:rPr>
                 <w:rFonts w:ascii="Courier New" w:eastAsia="Courier New" w:hAnsi="Courier New" w:cs="Courier New"/>
@@ -7862,9 +7289,8 @@
                 <w:sz w:val="18"/>
                 <w:szCs w:val="18"/>
               </w:rPr>
-              <w:t>nCOMMIT</w:t>
-            </w:r>
-            <w:proofErr w:type="spellEnd"/>
+              <w:t xml:space="preserve"> </w:t>
+            </w:r>
             <w:r>
               <w:rPr>
                 <w:rFonts w:ascii="Courier New" w:eastAsia="Courier New" w:hAnsi="Courier New" w:cs="Courier New"/>
@@ -7872,7 +7298,7 @@
                 <w:sz w:val="18"/>
                 <w:szCs w:val="18"/>
               </w:rPr>
-              <w:t>;</w:t>
+              <w:t>COMMIT;</w:t>
             </w:r>
           </w:p>
           <w:p>
@@ -7948,12 +7374,6 @@
         <w:gridCol w:w="9360"/>
       </w:tblGrid>
       <w:tr>
-        <w:tblPrEx>
-          <w:tblCellMar>
-            <w:top w:w="0" w:type="dxa"/>
-            <w:bottom w:w="0" w:type="dxa"/>
-          </w:tblCellMar>
-        </w:tblPrEx>
         <w:tc>
           <w:tcPr>
             <w:tcW w:w="0" w:type="auto"/>
@@ -8013,12 +7433,6 @@
         <w:gridCol w:w="8912"/>
       </w:tblGrid>
       <w:tr>
-        <w:tblPrEx>
-          <w:tblCellMar>
-            <w:top w:w="0" w:type="dxa"/>
-            <w:bottom w:w="0" w:type="dxa"/>
-          </w:tblCellMar>
-        </w:tblPrEx>
         <w:tc>
           <w:tcPr>
             <w:tcW w:w="0" w:type="auto"/>
@@ -8144,7 +7558,25 @@
                 <w:sz w:val="21"/>
                 <w:szCs w:val="21"/>
               </w:rPr>
-              <w:t>, but existing shift_assignments are untouched.</w:t>
+              <w:t xml:space="preserve">, but existing </w:t>
+            </w:r>
+            <w:proofErr w:type="spellStart"/>
+            <w:r>
+              <w:rPr>
+                <w:color w:val="0F172A"/>
+                <w:sz w:val="21"/>
+                <w:szCs w:val="21"/>
+              </w:rPr>
+              <w:t>shift_assignments</w:t>
+            </w:r>
+            <w:proofErr w:type="spellEnd"/>
+            <w:r>
+              <w:rPr>
+                <w:color w:val="0F172A"/>
+                <w:sz w:val="21"/>
+                <w:szCs w:val="21"/>
+              </w:rPr>
+              <w:t xml:space="preserve"> are untouched.</w:t>
             </w:r>
           </w:p>
           <w:p>
@@ -8157,18 +7589,36 @@
                 <w:sz w:val="21"/>
                 <w:szCs w:val="21"/>
               </w:rPr>
-              <w:t xml:space="preserve">For future assignments, I run a scan within the same de-certification transaction. I look for all shift_assignments WHERE user_id </w:t>
-            </w:r>
-            <w:proofErr w:type="gramStart"/>
-            <w:r>
-              <w:rPr>
-                <w:color w:val="0F172A"/>
-                <w:sz w:val="21"/>
-                <w:szCs w:val="21"/>
-              </w:rPr>
-              <w:t>= :userId</w:t>
-            </w:r>
-            <w:proofErr w:type="gramEnd"/>
+              <w:t xml:space="preserve">For future assignments, I run a scan within the same de-certification transaction. I look for all shift_assignments WHERE user_id = :userId AND </w:t>
+            </w:r>
+            <w:proofErr w:type="spellStart"/>
+            <w:r>
+              <w:rPr>
+                <w:color w:val="0F172A"/>
+                <w:sz w:val="21"/>
+                <w:szCs w:val="21"/>
+              </w:rPr>
+              <w:t>shift.location_id</w:t>
+            </w:r>
+            <w:proofErr w:type="spellEnd"/>
+            <w:r>
+              <w:rPr>
+                <w:color w:val="0F172A"/>
+                <w:sz w:val="21"/>
+                <w:szCs w:val="21"/>
+              </w:rPr>
+              <w:t xml:space="preserve"> = :</w:t>
+            </w:r>
+            <w:proofErr w:type="spellStart"/>
+            <w:r>
+              <w:rPr>
+                <w:color w:val="0F172A"/>
+                <w:sz w:val="21"/>
+                <w:szCs w:val="21"/>
+              </w:rPr>
+              <w:t>revokedLocationId</w:t>
+            </w:r>
+            <w:proofErr w:type="spellEnd"/>
             <w:r>
               <w:rPr>
                 <w:color w:val="0F172A"/>
@@ -8178,23 +7628,13 @@
               <w:t xml:space="preserve"> AND </w:t>
             </w:r>
             <w:proofErr w:type="spellStart"/>
-            <w:proofErr w:type="gramStart"/>
-            <w:r>
-              <w:rPr>
-                <w:color w:val="0F172A"/>
-                <w:sz w:val="21"/>
-                <w:szCs w:val="21"/>
-              </w:rPr>
-              <w:t>shift.location</w:t>
-            </w:r>
-            <w:proofErr w:type="gramEnd"/>
-            <w:r>
-              <w:rPr>
-                <w:color w:val="0F172A"/>
-                <w:sz w:val="21"/>
-                <w:szCs w:val="21"/>
-              </w:rPr>
-              <w:t>_id</w:t>
+            <w:r>
+              <w:rPr>
+                <w:color w:val="0F172A"/>
+                <w:sz w:val="21"/>
+                <w:szCs w:val="21"/>
+              </w:rPr>
+              <w:t>shift.start_utc</w:t>
             </w:r>
             <w:proofErr w:type="spellEnd"/>
             <w:r>
@@ -8203,81 +7643,7 @@
                 <w:sz w:val="21"/>
                 <w:szCs w:val="21"/>
               </w:rPr>
-              <w:t xml:space="preserve"> </w:t>
-            </w:r>
-            <w:proofErr w:type="gramStart"/>
-            <w:r>
-              <w:rPr>
-                <w:color w:val="0F172A"/>
-                <w:sz w:val="21"/>
-                <w:szCs w:val="21"/>
-              </w:rPr>
-              <w:t>= :</w:t>
-            </w:r>
-            <w:proofErr w:type="spellStart"/>
-            <w:r>
-              <w:rPr>
-                <w:color w:val="0F172A"/>
-                <w:sz w:val="21"/>
-                <w:szCs w:val="21"/>
-              </w:rPr>
-              <w:t>revokedLocationId</w:t>
-            </w:r>
-            <w:proofErr w:type="spellEnd"/>
-            <w:proofErr w:type="gramEnd"/>
-            <w:r>
-              <w:rPr>
-                <w:color w:val="0F172A"/>
-                <w:sz w:val="21"/>
-                <w:szCs w:val="21"/>
-              </w:rPr>
-              <w:t xml:space="preserve"> AND </w:t>
-            </w:r>
-            <w:proofErr w:type="spellStart"/>
-            <w:proofErr w:type="gramStart"/>
-            <w:r>
-              <w:rPr>
-                <w:color w:val="0F172A"/>
-                <w:sz w:val="21"/>
-                <w:szCs w:val="21"/>
-              </w:rPr>
-              <w:t>shift.start</w:t>
-            </w:r>
-            <w:proofErr w:type="gramEnd"/>
-            <w:r>
-              <w:rPr>
-                <w:color w:val="0F172A"/>
-                <w:sz w:val="21"/>
-                <w:szCs w:val="21"/>
-              </w:rPr>
-              <w:t>_utc</w:t>
-            </w:r>
-            <w:proofErr w:type="spellEnd"/>
-            <w:r>
-              <w:rPr>
-                <w:color w:val="0F172A"/>
-                <w:sz w:val="21"/>
-                <w:szCs w:val="21"/>
-              </w:rPr>
-              <w:t xml:space="preserve"> &gt; </w:t>
-            </w:r>
-            <w:proofErr w:type="gramStart"/>
-            <w:r>
-              <w:rPr>
-                <w:color w:val="0F172A"/>
-                <w:sz w:val="21"/>
-                <w:szCs w:val="21"/>
-              </w:rPr>
-              <w:t>NOW(</w:t>
-            </w:r>
-            <w:proofErr w:type="gramEnd"/>
-            <w:r>
-              <w:rPr>
-                <w:color w:val="0F172A"/>
-                <w:sz w:val="21"/>
-                <w:szCs w:val="21"/>
-              </w:rPr>
-              <w:t>) AND status = 'assigned'. These are unassigned — their status changes to 'removed', audit log entries written, and the manager(s) at that location receive notifications.</w:t>
+              <w:t xml:space="preserve"> &gt; NOW() AND status = 'assigned'. These are unassigned — their status changes to 'removed', audit log entries written, and the manager(s) at that location receive notifications.</w:t>
             </w:r>
           </w:p>
           <w:p>
@@ -8348,12 +7714,6 @@
         <w:gridCol w:w="9360"/>
       </w:tblGrid>
       <w:tr>
-        <w:tblPrEx>
-          <w:tblCellMar>
-            <w:top w:w="0" w:type="dxa"/>
-            <w:bottom w:w="0" w:type="dxa"/>
-          </w:tblCellMar>
-        </w:tblPrEx>
         <w:tc>
           <w:tcPr>
             <w:tcW w:w="0" w:type="auto"/>
@@ -8413,12 +7773,6 @@
         <w:gridCol w:w="8912"/>
       </w:tblGrid>
       <w:tr>
-        <w:tblPrEx>
-          <w:tblCellMar>
-            <w:top w:w="0" w:type="dxa"/>
-            <w:bottom w:w="0" w:type="dxa"/>
-          </w:tblCellMar>
-        </w:tblPrEx>
         <w:tc>
           <w:tcPr>
             <w:tcW w:w="0" w:type="auto"/>
@@ -8522,7 +7876,25 @@
                 <w:sz w:val="21"/>
                 <w:szCs w:val="21"/>
               </w:rPr>
-              <w:t>My solution: never store UTC offsets for availability. Store availability as clock time only — '09:00 MON' — and the user's IANA timezone identifier — 'America/</w:t>
+              <w:t xml:space="preserve">My solution: never store UTC offsets for availability. Store availability as clock time only — '09:00 MON' — and the user's IANA </w:t>
+            </w:r>
+            <w:proofErr w:type="spellStart"/>
+            <w:r>
+              <w:rPr>
+                <w:color w:val="0F172A"/>
+                <w:sz w:val="21"/>
+                <w:szCs w:val="21"/>
+              </w:rPr>
+              <w:t>timezone</w:t>
+            </w:r>
+            <w:proofErr w:type="spellEnd"/>
+            <w:r>
+              <w:rPr>
+                <w:color w:val="0F172A"/>
+                <w:sz w:val="21"/>
+                <w:szCs w:val="21"/>
+              </w:rPr>
+              <w:t xml:space="preserve"> identifier — 'America/</w:t>
             </w:r>
             <w:proofErr w:type="spellStart"/>
             <w:r>
@@ -8971,12 +8343,6 @@
         <w:gridCol w:w="9360"/>
       </w:tblGrid>
       <w:tr>
-        <w:tblPrEx>
-          <w:tblCellMar>
-            <w:top w:w="0" w:type="dxa"/>
-            <w:bottom w:w="0" w:type="dxa"/>
-          </w:tblCellMar>
-        </w:tblPrEx>
         <w:tc>
           <w:tcPr>
             <w:tcW w:w="0" w:type="auto"/>
@@ -9036,12 +8402,6 @@
         <w:gridCol w:w="8912"/>
       </w:tblGrid>
       <w:tr>
-        <w:tblPrEx>
-          <w:tblCellMar>
-            <w:top w:w="0" w:type="dxa"/>
-            <w:bottom w:w="0" w:type="dxa"/>
-          </w:tblCellMar>
-        </w:tblPrEx>
         <w:tc>
           <w:tcPr>
             <w:tcW w:w="0" w:type="auto"/>
@@ -9144,7 +8504,7 @@
                 <w:sz w:val="21"/>
                 <w:szCs w:val="21"/>
               </w:rPr>
-              <w:t>Now both try to enter the database transaction. The first call to pg_advisory_xact_lock(hashtext(</w:t>
+              <w:t xml:space="preserve">Now both try to enter the database transaction. The first call to </w:t>
             </w:r>
             <w:proofErr w:type="spellStart"/>
             <w:r>
@@ -9153,6 +8513,42 @@
                 <w:sz w:val="21"/>
                 <w:szCs w:val="21"/>
               </w:rPr>
+              <w:t>pg_advisory_xact_lock</w:t>
+            </w:r>
+            <w:proofErr w:type="spellEnd"/>
+            <w:r>
+              <w:rPr>
+                <w:color w:val="0F172A"/>
+                <w:sz w:val="21"/>
+                <w:szCs w:val="21"/>
+              </w:rPr>
+              <w:t>(</w:t>
+            </w:r>
+            <w:proofErr w:type="spellStart"/>
+            <w:r>
+              <w:rPr>
+                <w:color w:val="0F172A"/>
+                <w:sz w:val="21"/>
+                <w:szCs w:val="21"/>
+              </w:rPr>
+              <w:t>hashtext</w:t>
+            </w:r>
+            <w:proofErr w:type="spellEnd"/>
+            <w:r>
+              <w:rPr>
+                <w:color w:val="0F172A"/>
+                <w:sz w:val="21"/>
+                <w:szCs w:val="21"/>
+              </w:rPr>
+              <w:t>(</w:t>
+            </w:r>
+            <w:proofErr w:type="spellStart"/>
+            <w:r>
+              <w:rPr>
+                <w:color w:val="0F172A"/>
+                <w:sz w:val="21"/>
+                <w:szCs w:val="21"/>
+              </w:rPr>
               <w:t>carlos_user_id</w:t>
             </w:r>
             <w:proofErr w:type="spellEnd"/>
@@ -9202,25 +8598,7 @@
                 <w:szCs w:val="21"/>
               </w:rPr>
               <w:lastRenderedPageBreak/>
-              <w:t xml:space="preserve">Manager B's transaction doesn't insert anything. It returns HTTP 409 to the API handler. The API handler then emits a WebSocket event to Manager B's connected client: </w:t>
-            </w:r>
-            <w:proofErr w:type="gramStart"/>
-            <w:r>
-              <w:rPr>
-                <w:color w:val="0F172A"/>
-                <w:sz w:val="21"/>
-                <w:szCs w:val="21"/>
-              </w:rPr>
-              <w:t>assignment.conflict</w:t>
-            </w:r>
-            <w:proofErr w:type="gramEnd"/>
-            <w:r>
-              <w:rPr>
-                <w:color w:val="0F172A"/>
-                <w:sz w:val="21"/>
-                <w:szCs w:val="21"/>
-              </w:rPr>
-              <w:t xml:space="preserve"> with the message. Manager B sees the conflict notification within milliseconds.</w:t>
+              <w:t>Manager B's transaction doesn't insert anything. It returns HTTP 409 to the API handler. The API handler then emits a WebSocket event to Manager B's connected client: assignment.conflict with the message. Manager B sees the conflict notification within milliseconds.</w:t>
             </w:r>
           </w:p>
           <w:p>
@@ -9296,12 +8674,6 @@
         <w:gridCol w:w="9360"/>
       </w:tblGrid>
       <w:tr>
-        <w:tblPrEx>
-          <w:tblCellMar>
-            <w:top w:w="0" w:type="dxa"/>
-            <w:bottom w:w="0" w:type="dxa"/>
-          </w:tblCellMar>
-        </w:tblPrEx>
         <w:tc>
           <w:tcPr>
             <w:tcW w:w="0" w:type="auto"/>
@@ -9361,12 +8733,6 @@
         <w:gridCol w:w="8912"/>
       </w:tblGrid>
       <w:tr>
-        <w:tblPrEx>
-          <w:tblCellMar>
-            <w:top w:w="0" w:type="dxa"/>
-            <w:bottom w:w="0" w:type="dxa"/>
-          </w:tblCellMar>
-        </w:tblPrEx>
         <w:tc>
           <w:tcPr>
             <w:tcW w:w="0" w:type="auto"/>
@@ -9456,25 +8822,7 @@
                 <w:sz w:val="21"/>
                 <w:szCs w:val="21"/>
               </w:rPr>
-              <w:t xml:space="preserve">Here's the exact sequence: Manager publishes a schedule. The publish transaction inserts notification records into the notifications table for every affected staff member — inside the same transaction as the publish itself. </w:t>
-            </w:r>
-            <w:proofErr w:type="gramStart"/>
-            <w:r>
-              <w:rPr>
-                <w:color w:val="0F172A"/>
-                <w:sz w:val="21"/>
-                <w:szCs w:val="21"/>
-              </w:rPr>
-              <w:t>So</w:t>
-            </w:r>
-            <w:proofErr w:type="gramEnd"/>
-            <w:r>
-              <w:rPr>
-                <w:color w:val="0F172A"/>
-                <w:sz w:val="21"/>
-                <w:szCs w:val="21"/>
-              </w:rPr>
-              <w:t xml:space="preserve"> persistence is guaranteed before we even try to deliver.</w:t>
+              <w:t>Here's the exact sequence: Manager publishes a schedule. The publish transaction inserts notification records into the notifications table for every affected staff member — inside the same transaction as the publish itself. So persistence is guaranteed before we even try to deliver.</w:t>
             </w:r>
           </w:p>
           <w:p>
@@ -9549,43 +8897,7 @@
                 <w:sz w:val="21"/>
                 <w:szCs w:val="21"/>
               </w:rPr>
-              <w:t xml:space="preserve">The notification center badge count is driven by the database — SELECT </w:t>
-            </w:r>
-            <w:proofErr w:type="gramStart"/>
-            <w:r>
-              <w:rPr>
-                <w:color w:val="0F172A"/>
-                <w:sz w:val="21"/>
-                <w:szCs w:val="21"/>
-              </w:rPr>
-              <w:t>COUNT(</w:t>
-            </w:r>
-            <w:proofErr w:type="gramEnd"/>
-            <w:r>
-              <w:rPr>
-                <w:color w:val="0F172A"/>
-                <w:sz w:val="21"/>
-                <w:szCs w:val="21"/>
-              </w:rPr>
-              <w:t xml:space="preserve">*) WHERE user_id </w:t>
-            </w:r>
-            <w:proofErr w:type="gramStart"/>
-            <w:r>
-              <w:rPr>
-                <w:color w:val="0F172A"/>
-                <w:sz w:val="21"/>
-                <w:szCs w:val="21"/>
-              </w:rPr>
-              <w:t>= :id</w:t>
-            </w:r>
-            <w:proofErr w:type="gramEnd"/>
-            <w:r>
-              <w:rPr>
-                <w:color w:val="0F172A"/>
-                <w:sz w:val="21"/>
-                <w:szCs w:val="21"/>
-              </w:rPr>
-              <w:t xml:space="preserve"> AND </w:t>
+              <w:t xml:space="preserve">The notification center badge count is driven by the database — SELECT COUNT(*) WHERE user_id = :id AND </w:t>
             </w:r>
             <w:proofErr w:type="spellStart"/>
             <w:r>
@@ -9635,12 +8947,6 @@
         <w:gridCol w:w="9360"/>
       </w:tblGrid>
       <w:tr>
-        <w:tblPrEx>
-          <w:tblCellMar>
-            <w:top w:w="0" w:type="dxa"/>
-            <w:bottom w:w="0" w:type="dxa"/>
-          </w:tblCellMar>
-        </w:tblPrEx>
         <w:tc>
           <w:tcPr>
             <w:tcW w:w="0" w:type="auto"/>
@@ -9700,12 +9006,6 @@
         <w:gridCol w:w="8912"/>
       </w:tblGrid>
       <w:tr>
-        <w:tblPrEx>
-          <w:tblCellMar>
-            <w:top w:w="0" w:type="dxa"/>
-            <w:bottom w:w="0" w:type="dxa"/>
-          </w:tblCellMar>
-        </w:tblPrEx>
         <w:tc>
           <w:tcPr>
             <w:tcW w:w="0" w:type="auto"/>
@@ -9862,12 +9162,6 @@
         <w:gridCol w:w="9360"/>
       </w:tblGrid>
       <w:tr>
-        <w:tblPrEx>
-          <w:tblCellMar>
-            <w:top w:w="0" w:type="dxa"/>
-            <w:bottom w:w="0" w:type="dxa"/>
-          </w:tblCellMar>
-        </w:tblPrEx>
         <w:tc>
           <w:tcPr>
             <w:tcW w:w="0" w:type="auto"/>
@@ -9927,12 +9221,6 @@
         <w:gridCol w:w="8912"/>
       </w:tblGrid>
       <w:tr>
-        <w:tblPrEx>
-          <w:tblCellMar>
-            <w:top w:w="0" w:type="dxa"/>
-            <w:bottom w:w="0" w:type="dxa"/>
-          </w:tblCellMar>
-        </w:tblPrEx>
         <w:tc>
           <w:tcPr>
             <w:tcW w:w="0" w:type="auto"/>
@@ -10009,25 +9297,7 @@
                 <w:sz w:val="21"/>
                 <w:szCs w:val="21"/>
               </w:rPr>
-              <w:t xml:space="preserve">When the constraint engine blocks an assignment, the </w:t>
-            </w:r>
-            <w:proofErr w:type="spellStart"/>
-            <w:r>
-              <w:rPr>
-                <w:color w:val="0F172A"/>
-                <w:sz w:val="21"/>
-                <w:szCs w:val="21"/>
-              </w:rPr>
-              <w:t>SchedulingService</w:t>
-            </w:r>
-            <w:proofErr w:type="spellEnd"/>
-            <w:r>
-              <w:rPr>
-                <w:color w:val="0F172A"/>
-                <w:sz w:val="21"/>
-                <w:szCs w:val="21"/>
-              </w:rPr>
-              <w:t xml:space="preserve"> generates a suggestions list. Here's the algorithm, and the performance reasoning:</w:t>
+              <w:t>When the constraint engine blocks an assignment, the SchedulingService generates a suggestions list. Here's the algorithm, and the performance reasoning:</w:t>
             </w:r>
           </w:p>
           <w:p>
@@ -10165,12 +9435,6 @@
         <w:gridCol w:w="9360"/>
       </w:tblGrid>
       <w:tr>
-        <w:tblPrEx>
-          <w:tblCellMar>
-            <w:top w:w="0" w:type="dxa"/>
-            <w:bottom w:w="0" w:type="dxa"/>
-          </w:tblCellMar>
-        </w:tblPrEx>
         <w:tc>
           <w:tcPr>
             <w:tcW w:w="0" w:type="auto"/>
@@ -10230,12 +9494,6 @@
         <w:gridCol w:w="8912"/>
       </w:tblGrid>
       <w:tr>
-        <w:tblPrEx>
-          <w:tblCellMar>
-            <w:top w:w="0" w:type="dxa"/>
-            <w:bottom w:w="0" w:type="dxa"/>
-          </w:tblCellMar>
-        </w:tblPrEx>
         <w:tc>
           <w:tcPr>
             <w:tcW w:w="0" w:type="auto"/>
@@ -10397,12 +9655,6 @@
         <w:gridCol w:w="9360"/>
       </w:tblGrid>
       <w:tr>
-        <w:tblPrEx>
-          <w:tblCellMar>
-            <w:top w:w="0" w:type="dxa"/>
-            <w:bottom w:w="0" w:type="dxa"/>
-          </w:tblCellMar>
-        </w:tblPrEx>
         <w:tc>
           <w:tcPr>
             <w:tcW w:w="0" w:type="auto"/>
@@ -10462,12 +9714,6 @@
         <w:gridCol w:w="8912"/>
       </w:tblGrid>
       <w:tr>
-        <w:tblPrEx>
-          <w:tblCellMar>
-            <w:top w:w="0" w:type="dxa"/>
-            <w:bottom w:w="0" w:type="dxa"/>
-          </w:tblCellMar>
-        </w:tblPrEx>
         <w:tc>
           <w:tcPr>
             <w:tcW w:w="0" w:type="auto"/>
@@ -10642,9 +9888,9 @@
                 <w:sz w:val="18"/>
                 <w:szCs w:val="18"/>
               </w:rPr>
-              <w:t xml:space="preserve"> id </w:t>
-            </w:r>
-            <w:proofErr w:type="gramStart"/>
+              <w:t xml:space="preserve"> id = :</w:t>
+            </w:r>
+            <w:proofErr w:type="spellStart"/>
             <w:r>
               <w:rPr>
                 <w:rFonts w:ascii="Courier New" w:eastAsia="Courier New" w:hAnsi="Courier New" w:cs="Courier New"/>
@@ -10652,9 +9898,9 @@
                 <w:sz w:val="18"/>
                 <w:szCs w:val="18"/>
               </w:rPr>
-              <w:t>= :</w:t>
-            </w:r>
-            <w:proofErr w:type="spellStart"/>
+              <w:t>swapId</w:t>
+            </w:r>
+            <w:proofErr w:type="spellEnd"/>
             <w:r>
               <w:rPr>
                 <w:rFonts w:ascii="Courier New" w:eastAsia="Courier New" w:hAnsi="Courier New" w:cs="Courier New"/>
@@ -10662,10 +9908,9 @@
                 <w:sz w:val="18"/>
                 <w:szCs w:val="18"/>
               </w:rPr>
-              <w:t>swapId</w:t>
-            </w:r>
-            <w:proofErr w:type="spellEnd"/>
-            <w:proofErr w:type="gramEnd"/>
+              <w:t xml:space="preserve"> AND version = :</w:t>
+            </w:r>
+            <w:proofErr w:type="spellStart"/>
             <w:r>
               <w:rPr>
                 <w:rFonts w:ascii="Courier New" w:eastAsia="Courier New" w:hAnsi="Courier New" w:cs="Courier New"/>
@@ -10673,9 +9918,9 @@
                 <w:sz w:val="18"/>
                 <w:szCs w:val="18"/>
               </w:rPr>
-              <w:t xml:space="preserve"> AND version </w:t>
-            </w:r>
-            <w:proofErr w:type="gramStart"/>
+              <w:t>expectedVersion</w:t>
+            </w:r>
+            <w:proofErr w:type="spellEnd"/>
             <w:r>
               <w:rPr>
                 <w:rFonts w:ascii="Courier New" w:eastAsia="Courier New" w:hAnsi="Courier New" w:cs="Courier New"/>
@@ -10683,48 +9928,7 @@
                 <w:sz w:val="18"/>
                 <w:szCs w:val="18"/>
               </w:rPr>
-              <w:t>= :</w:t>
-            </w:r>
-            <w:proofErr w:type="spellStart"/>
-            <w:r>
-              <w:rPr>
-                <w:rFonts w:ascii="Courier New" w:eastAsia="Courier New" w:hAnsi="Courier New" w:cs="Courier New"/>
-                <w:color w:val="1E40AF"/>
-                <w:sz w:val="18"/>
-                <w:szCs w:val="18"/>
-              </w:rPr>
-              <w:t>expectedVersion</w:t>
-            </w:r>
-            <w:proofErr w:type="spellEnd"/>
-            <w:proofErr w:type="gramEnd"/>
-            <w:r>
-              <w:rPr>
-                <w:rFonts w:ascii="Courier New" w:eastAsia="Courier New" w:hAnsi="Courier New" w:cs="Courier New"/>
-                <w:color w:val="1E40AF"/>
-                <w:sz w:val="18"/>
-                <w:szCs w:val="18"/>
-              </w:rPr>
-              <w:t xml:space="preserve"> AND status = 'PENDING_ACCEPTEE</w:t>
-            </w:r>
-            <w:proofErr w:type="gramStart"/>
-            <w:r>
-              <w:rPr>
-                <w:rFonts w:ascii="Courier New" w:eastAsia="Courier New" w:hAnsi="Courier New" w:cs="Courier New"/>
-                <w:color w:val="1E40AF"/>
-                <w:sz w:val="18"/>
-                <w:szCs w:val="18"/>
-              </w:rPr>
-              <w:t>';\</w:t>
-            </w:r>
-            <w:proofErr w:type="gramEnd"/>
-            <w:r>
-              <w:rPr>
-                <w:rFonts w:ascii="Courier New" w:eastAsia="Courier New" w:hAnsi="Courier New" w:cs="Courier New"/>
-                <w:color w:val="1E40AF"/>
-                <w:sz w:val="18"/>
-                <w:szCs w:val="18"/>
-              </w:rPr>
-              <w:t>n-- If 0 rows affected → someone else changed it → HTTP 409</w:t>
+              <w:t xml:space="preserve"> AND status = 'PENDING_ACCEPTEE';\n-- If 0 rows affected → someone else changed it → HTTP 409</w:t>
             </w:r>
           </w:p>
           <w:p>
@@ -10795,12 +9999,6 @@
         <w:gridCol w:w="9360"/>
       </w:tblGrid>
       <w:tr>
-        <w:tblPrEx>
-          <w:tblCellMar>
-            <w:top w:w="0" w:type="dxa"/>
-            <w:bottom w:w="0" w:type="dxa"/>
-          </w:tblCellMar>
-        </w:tblPrEx>
         <w:tc>
           <w:tcPr>
             <w:tcW w:w="0" w:type="auto"/>
@@ -10861,12 +10059,6 @@
         <w:gridCol w:w="8912"/>
       </w:tblGrid>
       <w:tr>
-        <w:tblPrEx>
-          <w:tblCellMar>
-            <w:top w:w="0" w:type="dxa"/>
-            <w:bottom w:w="0" w:type="dxa"/>
-          </w:tblCellMar>
-        </w:tblPrEx>
         <w:tc>
           <w:tcPr>
             <w:tcW w:w="0" w:type="auto"/>
@@ -10985,7 +10177,6 @@
               <w:t xml:space="preserve">The codebase is structured as a modular monolith. The constraint engine is in a separate package (packages/constraint-engine/) with its own </w:t>
             </w:r>
             <w:proofErr w:type="spellStart"/>
-            <w:proofErr w:type="gramStart"/>
             <w:r>
               <w:rPr>
                 <w:color w:val="0F172A"/>
@@ -10995,7 +10186,6 @@
               <w:t>package.json</w:t>
             </w:r>
             <w:proofErr w:type="spellEnd"/>
-            <w:proofErr w:type="gramEnd"/>
             <w:r>
               <w:rPr>
                 <w:color w:val="0F172A"/>
@@ -11020,7 +10210,25 @@
                 <w:sz w:val="21"/>
                 <w:szCs w:val="21"/>
               </w:rPr>
-              <w:t>-tz for timezone math. This means I can run the full constraint engine test suite in milliseconds without spinning up a database. If I ever needed to move to microservices, the package boundary is already there — I just add an HTTP server wrapper around it.</w:t>
+              <w:t xml:space="preserve">-tz for </w:t>
+            </w:r>
+            <w:proofErr w:type="spellStart"/>
+            <w:r>
+              <w:rPr>
+                <w:color w:val="0F172A"/>
+                <w:sz w:val="21"/>
+                <w:szCs w:val="21"/>
+              </w:rPr>
+              <w:t>timezone</w:t>
+            </w:r>
+            <w:proofErr w:type="spellEnd"/>
+            <w:r>
+              <w:rPr>
+                <w:color w:val="0F172A"/>
+                <w:sz w:val="21"/>
+                <w:szCs w:val="21"/>
+              </w:rPr>
+              <w:t xml:space="preserve"> math. This means I can run the full constraint engine test suite in milliseconds without spinning up a database. If I ever needed to move to microservices, the package boundary is already there — I just add an HTTP server wrapper around it.</w:t>
             </w:r>
           </w:p>
           <w:p>
@@ -11033,25 +10241,7 @@
                 <w:sz w:val="21"/>
                 <w:szCs w:val="21"/>
               </w:rPr>
-              <w:t>Services (</w:t>
-            </w:r>
-            <w:proofErr w:type="spellStart"/>
-            <w:r>
-              <w:rPr>
-                <w:color w:val="0F172A"/>
-                <w:sz w:val="21"/>
-                <w:szCs w:val="21"/>
-              </w:rPr>
-              <w:t>SchedulingService</w:t>
-            </w:r>
-            <w:proofErr w:type="spellEnd"/>
-            <w:r>
-              <w:rPr>
-                <w:color w:val="0F172A"/>
-                <w:sz w:val="21"/>
-                <w:szCs w:val="21"/>
-              </w:rPr>
-              <w:t xml:space="preserve">, </w:t>
+              <w:t xml:space="preserve">Services (SchedulingService, </w:t>
             </w:r>
             <w:proofErr w:type="spellStart"/>
             <w:r>
@@ -11137,12 +10327,6 @@
         <w:gridCol w:w="9360"/>
       </w:tblGrid>
       <w:tr>
-        <w:tblPrEx>
-          <w:tblCellMar>
-            <w:top w:w="0" w:type="dxa"/>
-            <w:bottom w:w="0" w:type="dxa"/>
-          </w:tblCellMar>
-        </w:tblPrEx>
         <w:tc>
           <w:tcPr>
             <w:tcW w:w="0" w:type="auto"/>
@@ -11202,12 +10386,6 @@
         <w:gridCol w:w="8912"/>
       </w:tblGrid>
       <w:tr>
-        <w:tblPrEx>
-          <w:tblCellMar>
-            <w:top w:w="0" w:type="dxa"/>
-            <w:bottom w:w="0" w:type="dxa"/>
-          </w:tblCellMar>
-        </w:tblPrEx>
         <w:tc>
           <w:tcPr>
             <w:tcW w:w="0" w:type="auto"/>
@@ -11405,25 +10583,7 @@
                 <w:sz w:val="21"/>
                 <w:szCs w:val="21"/>
               </w:rPr>
-              <w:t xml:space="preserve">The question: if a staff member wants 20 hours but is available 40 hours, can they be assigned 40? My decision: yes. Desired hours is a preference for analytics, not a constraint. It powers the scheduling variance column in the fairness report, but it doesn't gate assignment eligibility. The alternative — treating desired hours as a hard limit — would make the manager's job impossible: they'd be blocked from covering shifts because a staff member's 'desired' threshold was hit, even if that staff member is willing and able to work more. Desired hours </w:t>
-            </w:r>
-            <w:proofErr w:type="gramStart"/>
-            <w:r>
-              <w:rPr>
-                <w:color w:val="0F172A"/>
-                <w:sz w:val="21"/>
-                <w:szCs w:val="21"/>
-              </w:rPr>
-              <w:t>reflects</w:t>
-            </w:r>
-            <w:proofErr w:type="gramEnd"/>
-            <w:r>
-              <w:rPr>
-                <w:color w:val="0F172A"/>
-                <w:sz w:val="21"/>
-                <w:szCs w:val="21"/>
-              </w:rPr>
-              <w:t xml:space="preserve"> a preference, not a maximum.</w:t>
+              <w:t>The question: if a staff member wants 20 hours but is available 40 hours, can they be assigned 40? My decision: yes. Desired hours is a preference for analytics, not a constraint. It powers the scheduling variance column in the fairness report, but it doesn't gate assignment eligibility. The alternative — treating desired hours as a hard limit — would make the manager's job impossible: they'd be blocked from covering shifts because a staff member's 'desired' threshold was hit, even if that staff member is willing and able to work more. Desired hours reflects a preference, not a maximum.</w:t>
             </w:r>
           </w:p>
           <w:p>
@@ -11542,12 +10702,6 @@
         <w:gridCol w:w="9360"/>
       </w:tblGrid>
       <w:tr>
-        <w:tblPrEx>
-          <w:tblCellMar>
-            <w:top w:w="0" w:type="dxa"/>
-            <w:bottom w:w="0" w:type="dxa"/>
-          </w:tblCellMar>
-        </w:tblPrEx>
         <w:tc>
           <w:tcPr>
             <w:tcW w:w="0" w:type="auto"/>
@@ -11591,43 +10745,7 @@
                 <w:sz w:val="18"/>
                 <w:szCs w:val="18"/>
               </w:rPr>
-              <w:t xml:space="preserve">Priority Soft </w:t>
-            </w:r>
-            <w:proofErr w:type="gramStart"/>
-            <w:r>
-              <w:rPr>
-                <w:color w:val="93C5FD"/>
-                <w:sz w:val="18"/>
-                <w:szCs w:val="18"/>
-              </w:rPr>
-              <w:t>Assessment  |</w:t>
-            </w:r>
-            <w:proofErr w:type="gramEnd"/>
-            <w:r>
-              <w:rPr>
-                <w:color w:val="93C5FD"/>
-                <w:sz w:val="18"/>
-                <w:szCs w:val="18"/>
-              </w:rPr>
-              <w:t xml:space="preserve">  16 </w:t>
-            </w:r>
-            <w:proofErr w:type="gramStart"/>
-            <w:r>
-              <w:rPr>
-                <w:color w:val="93C5FD"/>
-                <w:sz w:val="18"/>
-                <w:szCs w:val="18"/>
-              </w:rPr>
-              <w:t>Questions  |</w:t>
-            </w:r>
-            <w:proofErr w:type="gramEnd"/>
-            <w:r>
-              <w:rPr>
-                <w:color w:val="93C5FD"/>
-                <w:sz w:val="18"/>
-                <w:szCs w:val="18"/>
-              </w:rPr>
-              <w:t xml:space="preserve">  FAANG-Grade Technical Depth</w:t>
+              <w:t>Priority Soft Assessment  |  16 Questions  |  FAANG-Grade Technical Depth</w:t>
             </w:r>
           </w:p>
         </w:tc>
@@ -11683,18 +10801,8 @@
         <w:sz w:val="16"/>
         <w:szCs w:val="16"/>
       </w:rPr>
-      <w:t xml:space="preserve">Coastal </w:t>
+      <w:t>Coastal Eats ShiftSync</w:t>
     </w:r>
-    <w:proofErr w:type="gramStart"/>
-    <w:r>
-      <w:rPr>
-        <w:color w:val="64748B"/>
-        <w:sz w:val="16"/>
-        <w:szCs w:val="16"/>
-      </w:rPr>
-      <w:t>Eats  ShiftSync</w:t>
-    </w:r>
-    <w:proofErr w:type="gramEnd"/>
     <w:r>
       <w:rPr>
         <w:color w:val="64748B"/>

</xml_diff>